<commit_message>
BD Vancouver Updates: owner section verified line by line against the transcript
Every owner line now states only what the transcript supports. Items nobody took on the call
(Fraser Mills tryout, MCM, the conversions blurb) say so; surnames the meeting never spoke are
kept in the synopsis with a confidence tag and out of the executive summary. "Mike Dakotis" is
Michael De Cotiis of Pinnacle International, confirmed by Ian.

Co-Authored-By: Claude Fable 5.1 <noreply@anthropic.com>
Claude-Session: https://claude.ai/code/session_01J55941tRFE1tGX63LJBUVG
</commit_message>
<xml_diff>
--- a/docs/BD-Vancouver-Updates-ExecSummary-2026-09-03.docx
+++ b/docs/BD-Vancouver-Updates-ExecSummary-2026-09-03.docx
@@ -302,7 +302,7 @@
         </w:numPr>
       </w:pPr>
       <w:r>
-        <w:t xml:space="preserve">Health-sector architect outreach runs from </w:t>
+        <w:t xml:space="preserve">Health-sector architect outreach to run from </w:t>
       </w:r>
       <w:r>
         <w:rPr>
@@ -312,7 +312,7 @@
         <w:t>one coordinated target list</w:t>
       </w:r>
       <w:r>
-        <w:t>, one owner per contact. Ian prepares the list and talking points.</w:t>
+        <w:t>, one owner per contact, so three people do not call the same architect (Ian’s proposal, no objection on the call). Ian prepares the list and talking points.</w:t>
       </w:r>
     </w:p>
     <w:p>
@@ -334,7 +334,11 @@
         <w:t xml:space="preserve"> </w:t>
       </w:r>
       <w:r>
-        <w:t>(office to hotel or residential, S3 bylaw thresholds) become a promoted service line. Quote the report only; the upgrade work follows. Rory and Ian put it on the website and LinkedIn; Omar raises it with Colliers as the thing we can do for them.</w:t>
+        <w:t xml:space="preserve">(office to hotel or residential, S3 bylaw thresholds) become a promoted service line. Quote the report only; the </w:t>
+      </w:r>
+      <w:r>
+        <w:lastRenderedPageBreak/>
+        <w:t>upgrade work follows. Rory suggested a website and LinkedIn blurb, Ian will draft it; Omar raises it with Colliers as the thing we can do for them.</w:t>
       </w:r>
     </w:p>
     <w:p>
@@ -346,7 +350,6 @@
         </w:numPr>
       </w:pPr>
       <w:r>
-        <w:lastRenderedPageBreak/>
         <w:t xml:space="preserve">The Stantec pitch belongs to </w:t>
       </w:r>
       <w:r>
@@ -373,10 +376,10 @@
           <w:b/>
           <w:bCs/>
         </w:rPr>
-        <w:t>Omar becomes gatekeeper</w:t>
-      </w:r>
-      <w:r>
-        <w:t xml:space="preserve"> of inbound opportunities in the app. Ian gets Jim onto the current build so the Teams spreadsheet can retire.</w:t>
+        <w:t>Omar to become gatekeeper</w:t>
+      </w:r>
+      <w:r>
+        <w:t xml:space="preserve"> of inbound opportunities in the app; he and Ian sit down next week. Ian gets Jim onto the current build so the Teams spreadsheet can retire.</w:t>
       </w:r>
     </w:p>
     <w:p>
@@ -561,7 +564,7 @@
                 <w:rFonts w:ascii="Segoe UI" w:hAnsi="Segoe UI" w:cs="Segoe UI"/>
                 <w:sz w:val="17"/>
               </w:rPr>
-              <w:t>Perkins&amp;Will client-appreciation party. No invite yet; Omar, Rory, Jim and JM each working a contact</w:t>
+              <w:t>Perkins&amp;Will client-appreciation party. No invite yet; Omar, Rory and Jim each working a contact</w:t>
             </w:r>
           </w:p>
         </w:tc>
@@ -585,7 +588,7 @@
                 <w:rFonts w:ascii="Segoe UI" w:hAnsi="Segoe UI" w:cs="Segoe UI"/>
                 <w:sz w:val="17"/>
               </w:rPr>
-              <w:t>all</w:t>
+              <w:t>Omar, Rory, Jim</w:t>
             </w:r>
           </w:p>
         </w:tc>
@@ -632,7 +635,7 @@
                 <w:rFonts w:ascii="Segoe UI" w:hAnsi="Segoe UI" w:cs="Segoe UI"/>
                 <w:sz w:val="17"/>
               </w:rPr>
-              <w:t>Lunch with Mike Alivojvodic, Chris Dikeakos Architects</w:t>
+              <w:t>Lunch with Mike at CDA (Chris Dikeakos Architects)</w:t>
             </w:r>
           </w:p>
         </w:tc>
@@ -700,7 +703,7 @@
                 <w:rFonts w:ascii="Segoe UI" w:hAnsi="Segoe UI" w:cs="Segoe UI"/>
                 <w:sz w:val="17"/>
               </w:rPr>
-              <w:t>Omar takes the EGBC seismic retrofit course, the gate to the K-12 seismic list</w:t>
+              <w:t>Omar plans to take the EGBC seismic retrofit course, the gate to the K-12 seismic list</w:t>
             </w:r>
           </w:p>
         </w:tc>
@@ -925,7 +928,7 @@
                 <w:rFonts w:ascii="Segoe UI" w:hAnsi="Segoe UI" w:cs="Segoe UI"/>
                 <w:sz w:val="17"/>
               </w:rPr>
-              <w:t>JB</w:t>
+              <w:t>John (June owner)</w:t>
             </w:r>
           </w:p>
         </w:tc>
@@ -1025,7 +1028,7 @@
         <w:t>Omar:</w:t>
       </w:r>
       <w:r>
-        <w:t xml:space="preserve"> the Colliers introductions; NDY seismic-restraint referrals; the office-to-hotel seismic assessment (NDA, drawings, report fee) and the same offer to the Coal Harbour hotel developer; Stantec with Islam.</w:t>
+        <w:t xml:space="preserve"> the Colliers introductions, and ask Colliers what change-of-use work they see; NDY seismic-restraint referrals; the office-to-hotel seismic assessment (NDA, structural drawings, report fee) and the same offer to the Coal Harbour hotel developer; Stantec with Islam; with JM, the ex-employee contact at the Port Authority.</w:t>
       </w:r>
     </w:p>
     <w:p>
@@ -1044,7 +1047,14 @@
         <w:t>Jim:</w:t>
       </w:r>
       <w:r>
-        <w:t xml:space="preserve"> the “no transfers” presentation; lunch with Giovanni at Aquilini; San Diego RFP; the CDA lunch and a cold call for the second Mike.</w:t>
+        <w:t xml:space="preserve"> the</w:t>
+      </w:r>
+      <w:r>
+        <w:t xml:space="preserve"> “no transfers” presentation; lunch with Giovanni at Aquilini; the San Diego RFP this week; the CDA lunch on the 11th; a call to Michael De Cotiis at Pinnacle for </w:t>
+      </w:r>
+      <w:r>
+        <w:lastRenderedPageBreak/>
+        <w:t>lunch after the long weekend; check with Daler that MVE’s insurance update went back.</w:t>
       </w:r>
     </w:p>
     <w:p>
@@ -1066,7 +1076,7 @@
         <w:t xml:space="preserve"> </w:t>
       </w:r>
       <w:r>
-        <w:t>Fraser Mills tryout status; Gwyn Vose at Arcadis; a principal at MCM; Calgary; the Kelowna architect intro for Conor; call Brad Burnett at ITC.</w:t>
+        <w:t>call Gwyn at Arcadis for lunch; confirm with Beedie whether we are in the Fraser Mills tryout (nobody was sure on the call); Calgary, with Anthem and GGA direct; the Kelowna architect intro for Conor; call Brad at ITC. MCM is worth a visit and JM has the working contact there.</w:t>
       </w:r>
     </w:p>
     <w:p>
@@ -1085,7 +1095,7 @@
         <w:t>JB:</w:t>
       </w:r>
       <w:r>
-        <w:t xml:space="preserve"> Bosa lunch with Colin via Robert, October; Solterra one-on-one with Gerry Nichele this week or next.</w:t>
+        <w:t xml:space="preserve"> Bosa lunch with Colin via Robert, October; Solterra one-on-one with Jerry, the decision maker, this week or early next.</w:t>
       </w:r>
     </w:p>
     <w:p>
@@ -1104,7 +1114,10 @@
         <w:t>Rory:</w:t>
       </w:r>
       <w:r>
-        <w:t xml:space="preserve"> Continuum Architecture; the conversions blurb; Perkins&amp;Will invite via Ike.</w:t>
+        <w:t xml:space="preserve"> </w:t>
+      </w:r>
+      <w:r>
+        <w:t>Continuum Architecture, from Jim’s hand-over; ask Ike about the Perkins&amp;Will invite. The conversions blurb was his idea; Ian drafts it.</w:t>
       </w:r>
     </w:p>
     <w:p>
@@ -1139,14 +1152,10 @@
           <w:b/>
           <w:bCs/>
         </w:rPr>
-        <w:lastRenderedPageBreak/>
         <w:t>Conor:</w:t>
       </w:r>
       <w:r>
-        <w:t xml:space="preserve"> </w:t>
-      </w:r>
-      <w:r>
-        <w:t>Graham night; Lauren at Arcadis Kelowna for the three developer intros; Mission Group’s departed contact.</w:t>
+        <w:t xml:space="preserve"> Graham night, and two more invites; press Lauren in Kelowna for the three developer intros; follow Mission Group’s departed contact to wherever she lands.</w:t>
       </w:r>
     </w:p>
     <w:p>
@@ -1165,7 +1174,10 @@
         <w:t>Ian:</w:t>
       </w:r>
       <w:r>
-        <w:t xml:space="preserve"> the architect target list and talking points; the events list; Port Authority recon; Island intel and Continuum contacts to Rory; Jim onto the app; Omar set up as gatekeeper; this recap.</w:t>
+        <w:t xml:space="preserve"> </w:t>
+      </w:r>
+      <w:r>
+        <w:t>the architect target list and talking points; the events list; Port Authority recon; Island intel and Continuum contacts to Rory; the conversions blurb; Jim onto the app; Omar set up as gatekeeper; this recap.</w:t>
       </w:r>
     </w:p>
     <w:p>
@@ -1438,7 +1450,7 @@
   <w:abstractNum w:abstractNumId="0" w15:restartNumberingAfterBreak="0">
     <w:nsid w:val="0000A990"/>
     <w:multiLevelType w:val="multilevel"/>
-    <w:tmpl w:val="E08637E0"/>
+    <w:tmpl w:val="43DEF2FE"/>
     <w:lvl w:ilvl="0">
       <w:numFmt w:val="bullet"/>
       <w:lvlText w:val=" "/>
@@ -1515,7 +1527,7 @@
   <w:abstractNum w:abstractNumId="1" w15:restartNumberingAfterBreak="0">
     <w:nsid w:val="0000A991"/>
     <w:multiLevelType w:val="multilevel"/>
-    <w:tmpl w:val="770EDEEC"/>
+    <w:tmpl w:val="EA708CC0"/>
     <w:lvl w:ilvl="0">
       <w:numFmt w:val="bullet"/>
       <w:lvlText w:val=""/>
@@ -1619,7 +1631,7 @@
   <w:abstractNum w:abstractNumId="2" w15:restartNumberingAfterBreak="0">
     <w:nsid w:val="00A99411"/>
     <w:multiLevelType w:val="multilevel"/>
-    <w:tmpl w:val="53D80018"/>
+    <w:tmpl w:val="A808E712"/>
     <w:lvl w:ilvl="0">
       <w:start w:val="1"/>
       <w:numFmt w:val="decimal"/>
@@ -1702,13 +1714,13 @@
       </w:pPr>
     </w:lvl>
   </w:abstractNum>
-  <w:num w:numId="1" w16cid:durableId="790396079">
+  <w:num w:numId="1" w16cid:durableId="1274047665">
     <w:abstractNumId w:val="0"/>
   </w:num>
-  <w:num w:numId="2" w16cid:durableId="1743485016">
+  <w:num w:numId="2" w16cid:durableId="47152131">
     <w:abstractNumId w:val="1"/>
   </w:num>
-  <w:num w:numId="3" w16cid:durableId="1498812141">
+  <w:num w:numId="3" w16cid:durableId="531767138">
     <w:abstractNumId w:val="2"/>
     <w:lvlOverride w:ilvl="0">
       <w:startOverride w:val="1"/>
@@ -1738,7 +1750,7 @@
       <w:startOverride w:val="1"/>
     </w:lvlOverride>
   </w:num>
-  <w:num w:numId="4" w16cid:durableId="410666965">
+  <w:num w:numId="4" w16cid:durableId="1923635054">
     <w:abstractNumId w:val="1"/>
   </w:num>
 </w:numbering>
@@ -2969,7 +2981,7 @@
   <w:style w:type="table" w:styleId="TableGrid">
     <w:name w:val="Table Grid"/>
     <w:basedOn w:val="TableNormal"/>
-    <w:rsid w:val="0097274E"/>
+    <w:rsid w:val="004155AA"/>
     <w:pPr>
       <w:spacing w:after="0"/>
     </w:pPr>
@@ -2988,7 +3000,7 @@
     <w:name w:val="header"/>
     <w:basedOn w:val="Normal"/>
     <w:link w:val="HeaderChar"/>
-    <w:rsid w:val="0097274E"/>
+    <w:rsid w:val="004155AA"/>
     <w:pPr>
       <w:tabs>
         <w:tab w:val="center" w:pos="4680"/>
@@ -3001,7 +3013,7 @@
     <w:name w:val="Header Char"/>
     <w:basedOn w:val="DefaultParagraphFont"/>
     <w:link w:val="Header"/>
-    <w:rsid w:val="0097274E"/>
+    <w:rsid w:val="004155AA"/>
     <w:rPr>
       <w:rFonts w:ascii="Georgia" w:hAnsi="Georgia"/>
       <w:sz w:val="20"/>
@@ -3011,7 +3023,7 @@
     <w:name w:val="footer"/>
     <w:basedOn w:val="Normal"/>
     <w:link w:val="FooterChar"/>
-    <w:rsid w:val="0097274E"/>
+    <w:rsid w:val="004155AA"/>
     <w:pPr>
       <w:tabs>
         <w:tab w:val="center" w:pos="4680"/>
@@ -3024,7 +3036,7 @@
     <w:name w:val="Footer Char"/>
     <w:basedOn w:val="DefaultParagraphFont"/>
     <w:link w:val="Footer"/>
-    <w:rsid w:val="0097274E"/>
+    <w:rsid w:val="004155AA"/>
     <w:rPr>
       <w:rFonts w:ascii="Georgia" w:hAnsi="Georgia"/>
       <w:sz w:val="20"/>

</xml_diff>

<commit_message>
BD Vancouver Updates: names verified against the brain, Apollo, Hunter and the web; email version added
Every surname in the executive summary is now verified (Gerry Nichele, Brad Burnett, Gwyn Vose,
Peter Odegaard, Giovanni Gunawan, Thomas Lee, Fred Lin, Michael De Cotiis). Continuum's second
contact is Gregory Eeman, an architect, not a partner. KRA is Kirsten Reite Architecture. Open
questions reduced to twelve. Plain-text email version for the group. De Cotiis lunch logged as
Jim's next action on CRM engagement 11.

Co-Authored-By: Claude Fable 5.1 <noreply@anthropic.com>
Claude-Session: https://claude.ai/code/session_01J55941tRFE1tGX63LJBUVG
</commit_message>
<xml_diff>
--- a/docs/BD-Vancouver-Updates-ExecSummary-2026-09-03.docx
+++ b/docs/BD-Vancouver-Updates-ExecSummary-2026-09-03.docx
@@ -217,7 +217,7 @@
         <w:t>Continuum Architecture</w:t>
       </w:r>
       <w:r>
-        <w:t xml:space="preserve"> in Victoria, who appear to hold most of that developer’s work. Rory to follow up.</w:t>
+        <w:t xml:space="preserve"> in Victoria (partners Jeremy Beintema and Wil Wiens), who appear to hold most of that developer’s work. Rory to follow up.</w:t>
       </w:r>
     </w:p>
     <w:p>
@@ -302,7 +302,7 @@
         </w:numPr>
       </w:pPr>
       <w:r>
-        <w:t xml:space="preserve">Health-sector architect outreach to run from </w:t>
+        <w:t xml:space="preserve">Health-sector architect outreach runs from </w:t>
       </w:r>
       <w:r>
         <w:rPr>
@@ -312,7 +312,7 @@
         <w:t>one coordinated target list</w:t>
       </w:r>
       <w:r>
-        <w:t>, one owner per contact, so three people do not call the same architect (Ian’s proposal, no objection on the call). Ian prepares the list and talking points.</w:t>
+        <w:t>, one owner per contact, so three people do not call the same architect. Ian prepares the list and talking points.</w:t>
       </w:r>
     </w:p>
     <w:p>
@@ -1050,11 +1050,11 @@
         <w:t xml:space="preserve"> the</w:t>
       </w:r>
       <w:r>
-        <w:t xml:space="preserve"> “no transfers” presentation; lunch with Giovanni at Aquilini; the San Diego RFP this week; the CDA lunch on the 11th; a call to Michael De Cotiis at Pinnacle for </w:t>
+        <w:t xml:space="preserve"> “no transfers” presentation; lunch with Giovanni Gunawan at Aquilini; the San Diego RFP this week; the CDA lunch on the 11th; a call to Michael De Cotiis at </w:t>
       </w:r>
       <w:r>
         <w:lastRenderedPageBreak/>
-        <w:t>lunch after the long weekend; check with Daler that MVE’s insurance update went back.</w:t>
+        <w:t>Pinnacle for lunch after the long weekend; check with Daler that MVE’s insurance update went back.</w:t>
       </w:r>
     </w:p>
     <w:p>
@@ -1076,7 +1076,7 @@
         <w:t xml:space="preserve"> </w:t>
       </w:r>
       <w:r>
-        <w:t>call Gwyn at Arcadis for lunch; confirm with Beedie whether we are in the Fraser Mills tryout (nobody was sure on the call); Calgary, with Anthem and GGA direct; the Kelowna architect intro for Conor; call Brad at ITC. MCM is worth a visit and JM has the working contact there.</w:t>
+        <w:t>call Gwyn Vose at Arcadis for lunch; confirm with Beedie whether we are in the Fraser Mills tryout (nobody was sure on the call); Calgary, with Anthem and GGA direct; the Kelowna architect intro for Conor; call Brad Burnett at ITC. MCM is worth a visit and JM’s contact Peter Odegaard is a partner there.</w:t>
       </w:r>
     </w:p>
     <w:p>
@@ -1095,7 +1095,7 @@
         <w:t>JB:</w:t>
       </w:r>
       <w:r>
-        <w:t xml:space="preserve"> Bosa lunch with Colin via Robert, October; Solterra one-on-one with Jerry, the decision maker, this week or early next.</w:t>
+        <w:t xml:space="preserve"> Bosa lunch with Colin via Robert, October; Solterra one-on-one with Gerry Nichele, the decision maker, this week or early next.</w:t>
       </w:r>
     </w:p>
     <w:p>
@@ -1189,7 +1189,7 @@
           <w:i/>
           <w:iCs/>
         </w:rPr>
-        <w:t>Full synopsis with contacts, org history, the app’s existing records and fifteen open questions: see Ian.</w:t>
+        <w:t>Full synopsis with contacts, org history, the app’s existing records and the open questions: see Ian.</w:t>
       </w:r>
       <w:bookmarkEnd w:id="0"/>
       <w:bookmarkEnd w:id="5"/>
@@ -1450,7 +1450,7 @@
   <w:abstractNum w:abstractNumId="0" w15:restartNumberingAfterBreak="0">
     <w:nsid w:val="0000A990"/>
     <w:multiLevelType w:val="multilevel"/>
-    <w:tmpl w:val="43DEF2FE"/>
+    <w:tmpl w:val="C5E0A85A"/>
     <w:lvl w:ilvl="0">
       <w:numFmt w:val="bullet"/>
       <w:lvlText w:val=" "/>
@@ -1527,7 +1527,7 @@
   <w:abstractNum w:abstractNumId="1" w15:restartNumberingAfterBreak="0">
     <w:nsid w:val="0000A991"/>
     <w:multiLevelType w:val="multilevel"/>
-    <w:tmpl w:val="EA708CC0"/>
+    <w:tmpl w:val="CD1C58D8"/>
     <w:lvl w:ilvl="0">
       <w:numFmt w:val="bullet"/>
       <w:lvlText w:val=""/>
@@ -1631,7 +1631,7 @@
   <w:abstractNum w:abstractNumId="2" w15:restartNumberingAfterBreak="0">
     <w:nsid w:val="00A99411"/>
     <w:multiLevelType w:val="multilevel"/>
-    <w:tmpl w:val="A808E712"/>
+    <w:tmpl w:val="F86C0AE2"/>
     <w:lvl w:ilvl="0">
       <w:start w:val="1"/>
       <w:numFmt w:val="decimal"/>
@@ -1714,13 +1714,13 @@
       </w:pPr>
     </w:lvl>
   </w:abstractNum>
-  <w:num w:numId="1" w16cid:durableId="1274047665">
+  <w:num w:numId="1" w16cid:durableId="1817869411">
     <w:abstractNumId w:val="0"/>
   </w:num>
-  <w:num w:numId="2" w16cid:durableId="47152131">
+  <w:num w:numId="2" w16cid:durableId="2146043042">
     <w:abstractNumId w:val="1"/>
   </w:num>
-  <w:num w:numId="3" w16cid:durableId="531767138">
+  <w:num w:numId="3" w16cid:durableId="2004234309">
     <w:abstractNumId w:val="2"/>
     <w:lvlOverride w:ilvl="0">
       <w:startOverride w:val="1"/>
@@ -1750,7 +1750,7 @@
       <w:startOverride w:val="1"/>
     </w:lvlOverride>
   </w:num>
-  <w:num w:numId="4" w16cid:durableId="1923635054">
+  <w:num w:numId="4" w16cid:durableId="1795446285">
     <w:abstractNumId w:val="1"/>
   </w:num>
 </w:numbering>
@@ -2981,7 +2981,7 @@
   <w:style w:type="table" w:styleId="TableGrid">
     <w:name w:val="Table Grid"/>
     <w:basedOn w:val="TableNormal"/>
-    <w:rsid w:val="004155AA"/>
+    <w:rsid w:val="00E22B07"/>
     <w:pPr>
       <w:spacing w:after="0"/>
     </w:pPr>
@@ -3000,7 +3000,7 @@
     <w:name w:val="header"/>
     <w:basedOn w:val="Normal"/>
     <w:link w:val="HeaderChar"/>
-    <w:rsid w:val="004155AA"/>
+    <w:rsid w:val="00E22B07"/>
     <w:pPr>
       <w:tabs>
         <w:tab w:val="center" w:pos="4680"/>
@@ -3013,7 +3013,7 @@
     <w:name w:val="Header Char"/>
     <w:basedOn w:val="DefaultParagraphFont"/>
     <w:link w:val="Header"/>
-    <w:rsid w:val="004155AA"/>
+    <w:rsid w:val="00E22B07"/>
     <w:rPr>
       <w:rFonts w:ascii="Georgia" w:hAnsi="Georgia"/>
       <w:sz w:val="20"/>
@@ -3023,7 +3023,7 @@
     <w:name w:val="footer"/>
     <w:basedOn w:val="Normal"/>
     <w:link w:val="FooterChar"/>
-    <w:rsid w:val="004155AA"/>
+    <w:rsid w:val="00E22B07"/>
     <w:pPr>
       <w:tabs>
         <w:tab w:val="center" w:pos="4680"/>
@@ -3036,7 +3036,7 @@
     <w:name w:val="Footer Char"/>
     <w:basedOn w:val="DefaultParagraphFont"/>
     <w:link w:val="Footer"/>
-    <w:rsid w:val="004155AA"/>
+    <w:rsid w:val="00E22B07"/>
     <w:rPr>
       <w:rFonts w:ascii="Georgia" w:hAnsi="Georgia"/>
       <w:sz w:val="20"/>

</xml_diff>

<commit_message>
BD Vancouver Updates: Luciano Siffredi and Berry Architecture resolved; Ben Smith, Ike and the Colliers contact stay open
Luciano is Luciano Siffredi, Project Architect at Perkins&Will since 2024, previously Boniface
Oleksiuk Politano ("Bob" on the audio). "Barry Architecture" is Berry Architecture + Associates,
whose new Kelowna studio is led by Carlos Gamez Ruiz. The one Ben Smith in BC real estate on record
has no Starlight history and is not Jim's contact; no Ike or Isaac among Perkins&Will Vancouver's
87 staff on record; Omar's Colliers contact is not in any record we hold.

Co-Authored-By: Claude Fable 5.1 <noreply@anthropic.com>
Claude-Session: https://claude.ai/code/session_01J55941tRFE1tGX63LJBUVG
</commit_message>
<xml_diff>
--- a/docs/BD-Vancouver-Updates-ExecSummary-2026-09-03.docx
+++ b/docs/BD-Vancouver-Updates-ExecSummary-2026-09-03.docx
@@ -1076,7 +1076,7 @@
         <w:t xml:space="preserve"> </w:t>
       </w:r>
       <w:r>
-        <w:t>call Gwyn Vose at Arcadis for lunch; confirm with Beedie whether we are in the Fraser Mills tryout (nobody was sure on the call); Calgary, with Anthem and GGA direct; the Kelowna architect intro for Conor; call Brad Burnett at ITC. MCM is worth a visit and JM’s contact Peter Odegaard is a partner there.</w:t>
+        <w:t>call Gwyn Vose at Arcadis for lunch; confirm with Beedie whether we are in the Fraser Mills tryout (nobody was sure on the call); Calgary, with Anthem and GGA direct; the intro to Berry Architecture’s new Kelowna studio for Conor; call Brad Burnett at ITC. MCM is worth a visit and JM’s contact Peter Odegaard is a partner there.</w:t>
       </w:r>
     </w:p>
     <w:p>
@@ -1450,7 +1450,7 @@
   <w:abstractNum w:abstractNumId="0" w15:restartNumberingAfterBreak="0">
     <w:nsid w:val="0000A990"/>
     <w:multiLevelType w:val="multilevel"/>
-    <w:tmpl w:val="C5E0A85A"/>
+    <w:tmpl w:val="149A9714"/>
     <w:lvl w:ilvl="0">
       <w:numFmt w:val="bullet"/>
       <w:lvlText w:val=" "/>
@@ -1527,7 +1527,7 @@
   <w:abstractNum w:abstractNumId="1" w15:restartNumberingAfterBreak="0">
     <w:nsid w:val="0000A991"/>
     <w:multiLevelType w:val="multilevel"/>
-    <w:tmpl w:val="CD1C58D8"/>
+    <w:tmpl w:val="C6DEACFC"/>
     <w:lvl w:ilvl="0">
       <w:numFmt w:val="bullet"/>
       <w:lvlText w:val=""/>
@@ -1631,7 +1631,7 @@
   <w:abstractNum w:abstractNumId="2" w15:restartNumberingAfterBreak="0">
     <w:nsid w:val="00A99411"/>
     <w:multiLevelType w:val="multilevel"/>
-    <w:tmpl w:val="F86C0AE2"/>
+    <w:tmpl w:val="480C763C"/>
     <w:lvl w:ilvl="0">
       <w:start w:val="1"/>
       <w:numFmt w:val="decimal"/>
@@ -1714,13 +1714,13 @@
       </w:pPr>
     </w:lvl>
   </w:abstractNum>
-  <w:num w:numId="1" w16cid:durableId="1817869411">
+  <w:num w:numId="1" w16cid:durableId="1062171343">
     <w:abstractNumId w:val="0"/>
   </w:num>
-  <w:num w:numId="2" w16cid:durableId="2146043042">
+  <w:num w:numId="2" w16cid:durableId="1205679444">
     <w:abstractNumId w:val="1"/>
   </w:num>
-  <w:num w:numId="3" w16cid:durableId="2004234309">
+  <w:num w:numId="3" w16cid:durableId="313877127">
     <w:abstractNumId w:val="2"/>
     <w:lvlOverride w:ilvl="0">
       <w:startOverride w:val="1"/>
@@ -1750,7 +1750,7 @@
       <w:startOverride w:val="1"/>
     </w:lvlOverride>
   </w:num>
-  <w:num w:numId="4" w16cid:durableId="1795446285">
+  <w:num w:numId="4" w16cid:durableId="1315989662">
     <w:abstractNumId w:val="1"/>
   </w:num>
 </w:numbering>
@@ -2981,7 +2981,7 @@
   <w:style w:type="table" w:styleId="TableGrid">
     <w:name w:val="Table Grid"/>
     <w:basedOn w:val="TableNormal"/>
-    <w:rsid w:val="00E22B07"/>
+    <w:rsid w:val="00AF2B3D"/>
     <w:pPr>
       <w:spacing w:after="0"/>
     </w:pPr>
@@ -3000,7 +3000,7 @@
     <w:name w:val="header"/>
     <w:basedOn w:val="Normal"/>
     <w:link w:val="HeaderChar"/>
-    <w:rsid w:val="00E22B07"/>
+    <w:rsid w:val="00AF2B3D"/>
     <w:pPr>
       <w:tabs>
         <w:tab w:val="center" w:pos="4680"/>
@@ -3013,7 +3013,7 @@
     <w:name w:val="Header Char"/>
     <w:basedOn w:val="DefaultParagraphFont"/>
     <w:link w:val="Header"/>
-    <w:rsid w:val="00E22B07"/>
+    <w:rsid w:val="00AF2B3D"/>
     <w:rPr>
       <w:rFonts w:ascii="Georgia" w:hAnsi="Georgia"/>
       <w:sz w:val="20"/>
@@ -3023,7 +3023,7 @@
     <w:name w:val="footer"/>
     <w:basedOn w:val="Normal"/>
     <w:link w:val="FooterChar"/>
-    <w:rsid w:val="00E22B07"/>
+    <w:rsid w:val="00AF2B3D"/>
     <w:pPr>
       <w:tabs>
         <w:tab w:val="center" w:pos="4680"/>
@@ -3036,7 +3036,7 @@
     <w:name w:val="Footer Char"/>
     <w:basedOn w:val="DefaultParagraphFont"/>
     <w:link w:val="Footer"/>
-    <w:rsid w:val="00E22B07"/>
+    <w:rsid w:val="00AF2B3D"/>
     <w:rPr>
       <w:rFonts w:ascii="Georgia" w:hAnsi="Georgia"/>
       <w:sz w:val="20"/>

</xml_diff>

<commit_message>
BD Vancouver Updates: an Unknowns section in the email and summary, each item with the person who can close it
Co-Authored-By: Claude Fable 5.1 <noreply@anthropic.com>
Claude-Session: https://claude.ai/code/session_01J55941tRFE1tGX63LJBUVG
</commit_message>
<xml_diff>
--- a/docs/BD-Vancouver-Updates-ExecSummary-2026-09-03.docx
+++ b/docs/BD-Vancouver-Updates-ExecSummary-2026-09-03.docx
@@ -1182,6 +1182,163 @@
     </w:p>
     <w:p>
       <w:pPr>
+        <w:pStyle w:val="Heading2"/>
+      </w:pPr>
+      <w:bookmarkStart w:id="6" w:name="unknowns"/>
+      <w:bookmarkEnd w:id="5"/>
+      <w:r>
+        <w:t>Unknowns</w:t>
+      </w:r>
+    </w:p>
+    <w:p>
+      <w:pPr>
+        <w:pStyle w:val="FirstParagraph"/>
+      </w:pPr>
+      <w:r>
+        <w:t>Said on the call, not confirmable from our records or anywhere public. A one-line reply from the owner closes each.</w:t>
+      </w:r>
+    </w:p>
+    <w:p>
+      <w:pPr>
+        <w:pStyle w:val="Compact"/>
+        <w:numPr>
+          <w:ilvl w:val="0"/>
+          <w:numId w:val="5"/>
+        </w:numPr>
+      </w:pPr>
+      <w:r>
+        <w:rPr>
+          <w:b/>
+          <w:bCs/>
+        </w:rPr>
+        <w:t>Jim:</w:t>
+      </w:r>
+      <w:r>
+        <w:t xml:space="preserve"> Ben Smith’s company. Nothing turns up under “BAM”, and the only Ben Smith in BC real estate on record has no Starlight history.</w:t>
+      </w:r>
+    </w:p>
+    <w:p>
+      <w:pPr>
+        <w:pStyle w:val="Compact"/>
+        <w:numPr>
+          <w:ilvl w:val="0"/>
+          <w:numId w:val="5"/>
+        </w:numPr>
+      </w:pPr>
+      <w:r>
+        <w:rPr>
+          <w:b/>
+          <w:bCs/>
+        </w:rPr>
+        <w:t>Rory:</w:t>
+      </w:r>
+      <w:r>
+        <w:t xml:space="preserve"> </w:t>
+      </w:r>
+      <w:r>
+        <w:t>Ike’s surname at Perkins&amp;Will; no Ike or Isaac on their Vancouver staff list.</w:t>
+      </w:r>
+    </w:p>
+    <w:p>
+      <w:pPr>
+        <w:pStyle w:val="Compact"/>
+        <w:numPr>
+          <w:ilvl w:val="0"/>
+          <w:numId w:val="5"/>
+        </w:numPr>
+      </w:pPr>
+      <w:r>
+        <w:rPr>
+          <w:b/>
+          <w:bCs/>
+        </w:rPr>
+        <w:t>Omar:</w:t>
+      </w:r>
+      <w:r>
+        <w:t xml:space="preserve"> the Colliers contact’s name, and whether she is at Colliers Project Leaders or Colliers International.</w:t>
+      </w:r>
+    </w:p>
+    <w:p>
+      <w:pPr>
+        <w:pStyle w:val="Compact"/>
+        <w:numPr>
+          <w:ilvl w:val="0"/>
+          <w:numId w:val="5"/>
+        </w:numPr>
+      </w:pPr>
+      <w:r>
+        <w:rPr>
+          <w:b/>
+          <w:bCs/>
+        </w:rPr>
+        <w:t>Jim / JM:</w:t>
+      </w:r>
+      <w:r>
+        <w:t xml:space="preserve"> which Heather Lands building is our Block B and whether WHM holds A and C; which three teams are in Beedie’s Fraser Mills tryout.</w:t>
+      </w:r>
+    </w:p>
+    <w:p>
+      <w:pPr>
+        <w:pStyle w:val="Compact"/>
+        <w:numPr>
+          <w:ilvl w:val="0"/>
+          <w:numId w:val="5"/>
+        </w:numPr>
+      </w:pPr>
+      <w:r>
+        <w:rPr>
+          <w:b/>
+          <w:bCs/>
+        </w:rPr>
+        <w:t>Jim:</w:t>
+      </w:r>
+      <w:r>
+        <w:t xml:space="preserve"> is Trillium the Victoria seniors-housing operator Trillium Communities, and who is “Sue” there.</w:t>
+      </w:r>
+    </w:p>
+    <w:p>
+      <w:pPr>
+        <w:pStyle w:val="Compact"/>
+        <w:numPr>
+          <w:ilvl w:val="0"/>
+          <w:numId w:val="5"/>
+        </w:numPr>
+      </w:pPr>
+      <w:r>
+        <w:rPr>
+          <w:b/>
+          <w:bCs/>
+        </w:rPr>
+        <w:t>JB / John:</w:t>
+      </w:r>
+      <w:r>
+        <w:t xml:space="preserve"> who owns the Fraser Health list now, and its closing date.</w:t>
+      </w:r>
+    </w:p>
+    <w:p>
+      <w:pPr>
+        <w:pStyle w:val="Compact"/>
+        <w:numPr>
+          <w:ilvl w:val="0"/>
+          <w:numId w:val="5"/>
+        </w:numPr>
+      </w:pPr>
+      <w:r>
+        <w:rPr>
+          <w:b/>
+          <w:bCs/>
+        </w:rPr>
+        <w:t>JB:</w:t>
+      </w:r>
+      <w:r>
+        <w:t xml:space="preserve"> </w:t>
+      </w:r>
+      <w:r>
+        <w:t>which firms Jason, Kevin, Brian Webster and Mike Balza are with.</w:t>
+      </w:r>
+    </w:p>
+    <w:p>
+      <w:pPr>
         <w:pStyle w:val="FirstParagraph"/>
       </w:pPr>
       <w:r>
@@ -1189,10 +1346,10 @@
           <w:i/>
           <w:iCs/>
         </w:rPr>
-        <w:t>Full synopsis with contacts, org history, the app’s existing records and the open questions: see Ian.</w:t>
+        <w:t>Full synopsis with contacts, org history and the app’s existing records: see Ian.</w:t>
       </w:r>
       <w:bookmarkEnd w:id="0"/>
-      <w:bookmarkEnd w:id="5"/>
+      <w:bookmarkEnd w:id="6"/>
     </w:p>
     <w:sectPr>
       <w:headerReference w:type="even" r:id="rId7"/>
@@ -1450,7 +1607,7 @@
   <w:abstractNum w:abstractNumId="0" w15:restartNumberingAfterBreak="0">
     <w:nsid w:val="0000A990"/>
     <w:multiLevelType w:val="multilevel"/>
-    <w:tmpl w:val="149A9714"/>
+    <w:tmpl w:val="9E4C6E98"/>
     <w:lvl w:ilvl="0">
       <w:numFmt w:val="bullet"/>
       <w:lvlText w:val=" "/>
@@ -1527,7 +1684,7 @@
   <w:abstractNum w:abstractNumId="1" w15:restartNumberingAfterBreak="0">
     <w:nsid w:val="0000A991"/>
     <w:multiLevelType w:val="multilevel"/>
-    <w:tmpl w:val="C6DEACFC"/>
+    <w:tmpl w:val="4A7E3A0A"/>
     <w:lvl w:ilvl="0">
       <w:numFmt w:val="bullet"/>
       <w:lvlText w:val=""/>
@@ -1631,7 +1788,7 @@
   <w:abstractNum w:abstractNumId="2" w15:restartNumberingAfterBreak="0">
     <w:nsid w:val="00A99411"/>
     <w:multiLevelType w:val="multilevel"/>
-    <w:tmpl w:val="480C763C"/>
+    <w:tmpl w:val="C6AC4A68"/>
     <w:lvl w:ilvl="0">
       <w:start w:val="1"/>
       <w:numFmt w:val="decimal"/>
@@ -1714,13 +1871,13 @@
       </w:pPr>
     </w:lvl>
   </w:abstractNum>
-  <w:num w:numId="1" w16cid:durableId="1062171343">
+  <w:num w:numId="1" w16cid:durableId="1628926820">
     <w:abstractNumId w:val="0"/>
   </w:num>
-  <w:num w:numId="2" w16cid:durableId="1205679444">
+  <w:num w:numId="2" w16cid:durableId="125440539">
     <w:abstractNumId w:val="1"/>
   </w:num>
-  <w:num w:numId="3" w16cid:durableId="313877127">
+  <w:num w:numId="3" w16cid:durableId="1445536379">
     <w:abstractNumId w:val="2"/>
     <w:lvlOverride w:ilvl="0">
       <w:startOverride w:val="1"/>
@@ -1750,7 +1907,10 @@
       <w:startOverride w:val="1"/>
     </w:lvlOverride>
   </w:num>
-  <w:num w:numId="4" w16cid:durableId="1315989662">
+  <w:num w:numId="4" w16cid:durableId="168368920">
+    <w:abstractNumId w:val="1"/>
+  </w:num>
+  <w:num w:numId="5" w16cid:durableId="2047484072">
     <w:abstractNumId w:val="1"/>
   </w:num>
 </w:numbering>
@@ -2981,7 +3141,7 @@
   <w:style w:type="table" w:styleId="TableGrid">
     <w:name w:val="Table Grid"/>
     <w:basedOn w:val="TableNormal"/>
-    <w:rsid w:val="00AF2B3D"/>
+    <w:rsid w:val="006747C7"/>
     <w:pPr>
       <w:spacing w:after="0"/>
     </w:pPr>
@@ -3000,7 +3160,7 @@
     <w:name w:val="header"/>
     <w:basedOn w:val="Normal"/>
     <w:link w:val="HeaderChar"/>
-    <w:rsid w:val="00AF2B3D"/>
+    <w:rsid w:val="006747C7"/>
     <w:pPr>
       <w:tabs>
         <w:tab w:val="center" w:pos="4680"/>
@@ -3013,7 +3173,7 @@
     <w:name w:val="Header Char"/>
     <w:basedOn w:val="DefaultParagraphFont"/>
     <w:link w:val="Header"/>
-    <w:rsid w:val="00AF2B3D"/>
+    <w:rsid w:val="006747C7"/>
     <w:rPr>
       <w:rFonts w:ascii="Georgia" w:hAnsi="Georgia"/>
       <w:sz w:val="20"/>
@@ -3023,7 +3183,7 @@
     <w:name w:val="footer"/>
     <w:basedOn w:val="Normal"/>
     <w:link w:val="FooterChar"/>
-    <w:rsid w:val="00AF2B3D"/>
+    <w:rsid w:val="006747C7"/>
     <w:pPr>
       <w:tabs>
         <w:tab w:val="center" w:pos="4680"/>
@@ -3036,7 +3196,7 @@
     <w:name w:val="Footer Char"/>
     <w:basedOn w:val="DefaultParagraphFont"/>
     <w:link w:val="Footer"/>
-    <w:rsid w:val="00AF2B3D"/>
+    <w:rsid w:val="006747C7"/>
     <w:rPr>
       <w:rFonts w:ascii="Georgia" w:hAnsi="Georgia"/>
       <w:sz w:val="20"/>

</xml_diff>

<commit_message>
BD Vancouver Updates: names re-checked against the recording itself; CRM rows and Unknowns updated
A second listen (faster-whisper large-v3-turbo over the eleven name-critical windows of the full
recording, plain and vocabulary-prompted) settled: a Surrey arena for the Colliers contact; Gerry
Nichele, Mike Bosa and the Wilson Avenue (Metrotown) proposal at Solterra; BOP as Luciano's former
firm; MCM; Cambie and Marine; Stefan Hertel, not Stephanie, as the Mission Group contact who left;
Lauren Macaulay at Arcadis Kelowna; Eeman for the Continuum architect. Still unknown after two
listens: Ike, Kent Arroyo, the turn, Sue, BAM, the Colliers contact, Jason, Kevin.

Co-Authored-By: Claude Fable 5.1 <noreply@anthropic.com>
Claude-Session: https://claude.ai/code/session_01J55941tRFE1tGX63LJBUVG
</commit_message>
<xml_diff>
--- a/docs/BD-Vancouver-Updates-ExecSummary-2026-09-03.docx
+++ b/docs/BD-Vancouver-Updates-ExecSummary-2026-09-03.docx
@@ -107,7 +107,7 @@
         <w:t>Delta Aquatic Centre</w:t>
       </w:r>
       <w:r>
-        <w:t xml:space="preserve"> and a </w:t>
+        <w:t xml:space="preserve">, a </w:t>
       </w:r>
       <w:r>
         <w:rPr>
@@ -115,6 +115,16 @@
           <w:bCs/>
         </w:rPr>
         <w:t>BCIT lab</w:t>
+      </w:r>
+      <w:r>
+        <w:t xml:space="preserve"> and, if their bid lands, a </w:t>
+      </w:r>
+      <w:r>
+        <w:rPr>
+          <w:b/>
+          <w:bCs/>
+        </w:rPr>
+        <w:t>Surrey arena</w:t>
       </w:r>
       <w:r>
         <w:t>, with a say in team selection. She has offered introductions to the municipal recreation director and her private-sector lead. The BC Cancer prime-consultant RFP is already on file in the app.</w:t>
@@ -328,17 +338,14 @@
           <w:b/>
           <w:bCs/>
         </w:rPr>
+        <w:lastRenderedPageBreak/>
         <w:t>Seismic assessments and change-of-use work</w:t>
       </w:r>
       <w:r>
         <w:t xml:space="preserve"> </w:t>
       </w:r>
       <w:r>
-        <w:t xml:space="preserve">(office to hotel or residential, S3 bylaw thresholds) become a promoted service line. Quote the report only; the </w:t>
-      </w:r>
-      <w:r>
-        <w:lastRenderedPageBreak/>
-        <w:t>upgrade work follows. Rory suggested a website and LinkedIn blurb, Ian will draft it; Omar raises it with Colliers as the thing we can do for them.</w:t>
+        <w:t>(office to hotel or residential, S3 bylaw thresholds) become a promoted service line. Quote the report only; the upgrade work follows. Rory suggested a website and LinkedIn blurb, Ian will draft it; Omar raises it with Colliers as the thing we can do for them.</w:t>
       </w:r>
     </w:p>
     <w:p>
@@ -1044,17 +1051,14 @@
           <w:b/>
           <w:bCs/>
         </w:rPr>
+        <w:lastRenderedPageBreak/>
         <w:t>Jim:</w:t>
       </w:r>
       <w:r>
         <w:t xml:space="preserve"> the</w:t>
       </w:r>
       <w:r>
-        <w:t xml:space="preserve"> “no transfers” presentation; lunch with Giovanni Gunawan at Aquilini; the San Diego RFP this week; the CDA lunch on the 11th; a call to Michael De Cotiis at </w:t>
-      </w:r>
-      <w:r>
-        <w:lastRenderedPageBreak/>
-        <w:t>Pinnacle for lunch after the long weekend; check with Daler that MVE’s insurance update went back.</w:t>
+        <w:t xml:space="preserve"> “no transfers” presentation; lunch with Giovanni Gunawan at Aquilini; the San Diego RFP this week; the CDA lunch on the 11th; a call to Michael De Cotiis at Pinnacle for lunch after the long weekend; check with Daler that MVE’s insurance update went back.</w:t>
       </w:r>
     </w:p>
     <w:p>
@@ -1155,7 +1159,7 @@
         <w:t>Conor:</w:t>
       </w:r>
       <w:r>
-        <w:t xml:space="preserve"> Graham night, and two more invites; press Lauren in Kelowna for the three developer intros; follow Mission Group’s departed contact to wherever she lands.</w:t>
+        <w:t xml:space="preserve"> Graham night, and two more invites; press Lauren Macaulay at Arcadis Kelowna for the three developer intros; follow Mission Group’s departed contact, Stefan Hertel, to wherever he lands.</w:t>
       </w:r>
     </w:p>
     <w:p>
@@ -1293,7 +1297,7 @@
         <w:t>Jim:</w:t>
       </w:r>
       <w:r>
-        <w:t xml:space="preserve"> is Trillium the Victoria seniors-housing operator Trillium Communities, and who is “Sue” there.</w:t>
+        <w:t xml:space="preserve"> is Trillium the Victoria seniors-housing operator Trillium Communities, and is there a “Sue” there.</w:t>
       </w:r>
     </w:p>
     <w:p>
@@ -1309,10 +1313,13 @@
           <w:b/>
           <w:bCs/>
         </w:rPr>
-        <w:t>JB / John:</w:t>
-      </w:r>
-      <w:r>
-        <w:t xml:space="preserve"> who owns the Fraser Health list now, and its closing date.</w:t>
+        <w:t>Conor:</w:t>
+      </w:r>
+      <w:r>
+        <w:t xml:space="preserve"> where Stefan Hertel went after Mission Group, and the “Kent Arroyo” </w:t>
+      </w:r>
+      <w:r>
+        <w:t>townhouses we lost, which two listens could not make out.</w:t>
       </w:r>
     </w:p>
     <w:p>
@@ -1328,13 +1335,29 @@
           <w:b/>
           <w:bCs/>
         </w:rPr>
+        <w:t>JB / John:</w:t>
+      </w:r>
+      <w:r>
+        <w:t xml:space="preserve"> who owns the Fraser Health list now, and its closing date.</w:t>
+      </w:r>
+    </w:p>
+    <w:p>
+      <w:pPr>
+        <w:pStyle w:val="Compact"/>
+        <w:numPr>
+          <w:ilvl w:val="0"/>
+          <w:numId w:val="5"/>
+        </w:numPr>
+      </w:pPr>
+      <w:r>
+        <w:rPr>
+          <w:b/>
+          <w:bCs/>
+        </w:rPr>
         <w:t>JB:</w:t>
       </w:r>
       <w:r>
-        <w:t xml:space="preserve"> </w:t>
-      </w:r>
-      <w:r>
-        <w:t>which firms Jason, Kevin, Brian Webster and Mike Balza are with.</w:t>
+        <w:t xml:space="preserve"> who Jason is (he advised on Colin’s habits), and Kevin’s surname at Solterra.</w:t>
       </w:r>
     </w:p>
     <w:p>
@@ -1607,7 +1630,7 @@
   <w:abstractNum w:abstractNumId="0" w15:restartNumberingAfterBreak="0">
     <w:nsid w:val="0000A990"/>
     <w:multiLevelType w:val="multilevel"/>
-    <w:tmpl w:val="9E4C6E98"/>
+    <w:tmpl w:val="E3526F08"/>
     <w:lvl w:ilvl="0">
       <w:numFmt w:val="bullet"/>
       <w:lvlText w:val=" "/>
@@ -1684,7 +1707,7 @@
   <w:abstractNum w:abstractNumId="1" w15:restartNumberingAfterBreak="0">
     <w:nsid w:val="0000A991"/>
     <w:multiLevelType w:val="multilevel"/>
-    <w:tmpl w:val="4A7E3A0A"/>
+    <w:tmpl w:val="6282988E"/>
     <w:lvl w:ilvl="0">
       <w:numFmt w:val="bullet"/>
       <w:lvlText w:val=""/>
@@ -1788,7 +1811,7 @@
   <w:abstractNum w:abstractNumId="2" w15:restartNumberingAfterBreak="0">
     <w:nsid w:val="00A99411"/>
     <w:multiLevelType w:val="multilevel"/>
-    <w:tmpl w:val="C6AC4A68"/>
+    <w:tmpl w:val="A9F49BE0"/>
     <w:lvl w:ilvl="0">
       <w:start w:val="1"/>
       <w:numFmt w:val="decimal"/>
@@ -1871,13 +1894,13 @@
       </w:pPr>
     </w:lvl>
   </w:abstractNum>
-  <w:num w:numId="1" w16cid:durableId="1628926820">
+  <w:num w:numId="1" w16cid:durableId="11297839">
     <w:abstractNumId w:val="0"/>
   </w:num>
-  <w:num w:numId="2" w16cid:durableId="125440539">
+  <w:num w:numId="2" w16cid:durableId="1967540679">
     <w:abstractNumId w:val="1"/>
   </w:num>
-  <w:num w:numId="3" w16cid:durableId="1445536379">
+  <w:num w:numId="3" w16cid:durableId="219246459">
     <w:abstractNumId w:val="2"/>
     <w:lvlOverride w:ilvl="0">
       <w:startOverride w:val="1"/>
@@ -1907,10 +1930,10 @@
       <w:startOverride w:val="1"/>
     </w:lvlOverride>
   </w:num>
-  <w:num w:numId="4" w16cid:durableId="168368920">
+  <w:num w:numId="4" w16cid:durableId="1723140567">
     <w:abstractNumId w:val="1"/>
   </w:num>
-  <w:num w:numId="5" w16cid:durableId="2047484072">
+  <w:num w:numId="5" w16cid:durableId="1998027096">
     <w:abstractNumId w:val="1"/>
   </w:num>
 </w:numbering>
@@ -3141,7 +3164,7 @@
   <w:style w:type="table" w:styleId="TableGrid">
     <w:name w:val="Table Grid"/>
     <w:basedOn w:val="TableNormal"/>
-    <w:rsid w:val="006747C7"/>
+    <w:rsid w:val="0088273C"/>
     <w:pPr>
       <w:spacing w:after="0"/>
     </w:pPr>
@@ -3160,7 +3183,7 @@
     <w:name w:val="header"/>
     <w:basedOn w:val="Normal"/>
     <w:link w:val="HeaderChar"/>
-    <w:rsid w:val="006747C7"/>
+    <w:rsid w:val="0088273C"/>
     <w:pPr>
       <w:tabs>
         <w:tab w:val="center" w:pos="4680"/>
@@ -3173,7 +3196,7 @@
     <w:name w:val="Header Char"/>
     <w:basedOn w:val="DefaultParagraphFont"/>
     <w:link w:val="Header"/>
-    <w:rsid w:val="006747C7"/>
+    <w:rsid w:val="0088273C"/>
     <w:rPr>
       <w:rFonts w:ascii="Georgia" w:hAnsi="Georgia"/>
       <w:sz w:val="20"/>
@@ -3183,7 +3206,7 @@
     <w:name w:val="footer"/>
     <w:basedOn w:val="Normal"/>
     <w:link w:val="FooterChar"/>
-    <w:rsid w:val="006747C7"/>
+    <w:rsid w:val="0088273C"/>
     <w:pPr>
       <w:tabs>
         <w:tab w:val="center" w:pos="4680"/>
@@ -3196,7 +3219,7 @@
     <w:name w:val="Footer Char"/>
     <w:basedOn w:val="DefaultParagraphFont"/>
     <w:link w:val="Footer"/>
-    <w:rsid w:val="006747C7"/>
+    <w:rsid w:val="0088273C"/>
     <w:rPr>
       <w:rFonts w:ascii="Georgia" w:hAnsi="Georgia"/>
       <w:sz w:val="20"/>

</xml_diff>

<commit_message>
The Jason and Kevin JB spoke of are ours: Jason Stuart and Kevin Wurmlinger, not Bosa or Solterra staff
Ian's catch. Out of the Unknowns in the email and exec summary; the synopsis
names them in the Bosa and Solterra rows and the names table. CRM rows 450/451
corrected to match (Kevin assigned on Solterra as the other channel in).

Co-Authored-By: Claude Fable 5.1 <noreply@anthropic.com>
Claude-Session: https://claude.ai/code/session_01J55941tRFE1tGX63LJBUVG
</commit_message>
<xml_diff>
--- a/docs/BD-Vancouver-Updates-ExecSummary-2026-09-03.docx
+++ b/docs/BD-Vancouver-Updates-ExecSummary-2026-09-03.docx
@@ -1339,25 +1339,6 @@
       </w:r>
       <w:r>
         <w:t xml:space="preserve"> who owns the Fraser Health list now, and its closing date.</w:t>
-      </w:r>
-    </w:p>
-    <w:p>
-      <w:pPr>
-        <w:pStyle w:val="Compact"/>
-        <w:numPr>
-          <w:ilvl w:val="0"/>
-          <w:numId w:val="5"/>
-        </w:numPr>
-      </w:pPr>
-      <w:r>
-        <w:rPr>
-          <w:b/>
-          <w:bCs/>
-        </w:rPr>
-        <w:t>JB:</w:t>
-      </w:r>
-      <w:r>
-        <w:t xml:space="preserve"> who Jason is (he advised on Colin’s habits), and Kevin’s surname at Solterra.</w:t>
       </w:r>
     </w:p>
     <w:p>
@@ -1630,7 +1611,7 @@
   <w:abstractNum w:abstractNumId="0" w15:restartNumberingAfterBreak="0">
     <w:nsid w:val="0000A990"/>
     <w:multiLevelType w:val="multilevel"/>
-    <w:tmpl w:val="E3526F08"/>
+    <w:tmpl w:val="0D92DDA8"/>
     <w:lvl w:ilvl="0">
       <w:numFmt w:val="bullet"/>
       <w:lvlText w:val=" "/>
@@ -1707,7 +1688,7 @@
   <w:abstractNum w:abstractNumId="1" w15:restartNumberingAfterBreak="0">
     <w:nsid w:val="0000A991"/>
     <w:multiLevelType w:val="multilevel"/>
-    <w:tmpl w:val="6282988E"/>
+    <w:tmpl w:val="CC30F988"/>
     <w:lvl w:ilvl="0">
       <w:numFmt w:val="bullet"/>
       <w:lvlText w:val=""/>
@@ -1811,7 +1792,7 @@
   <w:abstractNum w:abstractNumId="2" w15:restartNumberingAfterBreak="0">
     <w:nsid w:val="00A99411"/>
     <w:multiLevelType w:val="multilevel"/>
-    <w:tmpl w:val="A9F49BE0"/>
+    <w:tmpl w:val="AA04D0F4"/>
     <w:lvl w:ilvl="0">
       <w:start w:val="1"/>
       <w:numFmt w:val="decimal"/>
@@ -1894,13 +1875,13 @@
       </w:pPr>
     </w:lvl>
   </w:abstractNum>
-  <w:num w:numId="1" w16cid:durableId="11297839">
+  <w:num w:numId="1" w16cid:durableId="724255877">
     <w:abstractNumId w:val="0"/>
   </w:num>
-  <w:num w:numId="2" w16cid:durableId="1967540679">
+  <w:num w:numId="2" w16cid:durableId="960576696">
     <w:abstractNumId w:val="1"/>
   </w:num>
-  <w:num w:numId="3" w16cid:durableId="219246459">
+  <w:num w:numId="3" w16cid:durableId="1941788727">
     <w:abstractNumId w:val="2"/>
     <w:lvlOverride w:ilvl="0">
       <w:startOverride w:val="1"/>
@@ -1930,10 +1911,10 @@
       <w:startOverride w:val="1"/>
     </w:lvlOverride>
   </w:num>
-  <w:num w:numId="4" w16cid:durableId="1723140567">
+  <w:num w:numId="4" w16cid:durableId="401636790">
     <w:abstractNumId w:val="1"/>
   </w:num>
-  <w:num w:numId="5" w16cid:durableId="1998027096">
+  <w:num w:numId="5" w16cid:durableId="2122413713">
     <w:abstractNumId w:val="1"/>
   </w:num>
 </w:numbering>
@@ -3164,7 +3145,7 @@
   <w:style w:type="table" w:styleId="TableGrid">
     <w:name w:val="Table Grid"/>
     <w:basedOn w:val="TableNormal"/>
-    <w:rsid w:val="0088273C"/>
+    <w:rsid w:val="00201A7E"/>
     <w:pPr>
       <w:spacing w:after="0"/>
     </w:pPr>
@@ -3183,7 +3164,7 @@
     <w:name w:val="header"/>
     <w:basedOn w:val="Normal"/>
     <w:link w:val="HeaderChar"/>
-    <w:rsid w:val="0088273C"/>
+    <w:rsid w:val="00201A7E"/>
     <w:pPr>
       <w:tabs>
         <w:tab w:val="center" w:pos="4680"/>
@@ -3196,7 +3177,7 @@
     <w:name w:val="Header Char"/>
     <w:basedOn w:val="DefaultParagraphFont"/>
     <w:link w:val="Header"/>
-    <w:rsid w:val="0088273C"/>
+    <w:rsid w:val="00201A7E"/>
     <w:rPr>
       <w:rFonts w:ascii="Georgia" w:hAnsi="Georgia"/>
       <w:sz w:val="20"/>
@@ -3206,7 +3187,7 @@
     <w:name w:val="footer"/>
     <w:basedOn w:val="Normal"/>
     <w:link w:val="FooterChar"/>
-    <w:rsid w:val="0088273C"/>
+    <w:rsid w:val="00201A7E"/>
     <w:pPr>
       <w:tabs>
         <w:tab w:val="center" w:pos="4680"/>
@@ -3219,7 +3200,7 @@
     <w:name w:val="Footer Char"/>
     <w:basedOn w:val="DefaultParagraphFont"/>
     <w:link w:val="Footer"/>
-    <w:rsid w:val="0088273C"/>
+    <w:rsid w:val="00201A7E"/>
     <w:rPr>
       <w:rFonts w:ascii="Georgia" w:hAnsi="Georgia"/>
       <w:sz w:val="20"/>

</xml_diff>

<commit_message>
Four unknowns, not seven: the Fraser Health list is Omar's, Block B is GBL's Parcel B, Trillium is Trillium Communities
Ian's catches. The email and exec summary carry no method language now, only
what the owner is asked. CRM row 469 (Fraser Health) owner set to Omar.

Co-Authored-By: Claude Fable 5.1 <noreply@anthropic.com>
Claude-Session: https://claude.ai/code/session_01J55941tRFE1tGX63LJBUVG
</commit_message>
<xml_diff>
--- a/docs/BD-Vancouver-Updates-ExecSummary-2026-09-03.docx
+++ b/docs/BD-Vancouver-Updates-ExecSummary-2026-09-03.docx
@@ -935,7 +935,7 @@
                 <w:rFonts w:ascii="Segoe UI" w:hAnsi="Segoe UI" w:cs="Segoe UI"/>
                 <w:sz w:val="17"/>
               </w:rPr>
-              <w:t>John (June owner)</w:t>
+              <w:t>Omar</w:t>
             </w:r>
           </w:p>
         </w:tc>
@@ -1055,10 +1055,10 @@
         <w:t>Jim:</w:t>
       </w:r>
       <w:r>
-        <w:t xml:space="preserve"> the</w:t>
-      </w:r>
-      <w:r>
-        <w:t xml:space="preserve"> “no transfers” presentation; lunch with Giovanni Gunawan at Aquilini; the San Diego RFP this week; the CDA lunch on the 11th; a call to Michael De Cotiis at Pinnacle for lunch after the long weekend; check with Daler that MVE’s insurance update went back.</w:t>
+        <w:t xml:space="preserve"> the </w:t>
+      </w:r>
+      <w:r>
+        <w:t>“no transfers” presentation; lunch with Giovanni Gunawan at Aquilini; the San Diego RFP this week; the CDA lunch on the 11th; a call to Michael De Cotiis at Pinnacle for lunch after the long weekend; check with Daler that MVE’s insurance update went back.</w:t>
       </w:r>
     </w:p>
     <w:p>
@@ -1199,7 +1199,7 @@
         <w:pStyle w:val="FirstParagraph"/>
       </w:pPr>
       <w:r>
-        <w:t>Said on the call, not confirmable from our records or anywhere public. A one-line reply from the owner closes each.</w:t>
+        <w:t>Four things from the call not yet pinned down. A one-line reply from the owner closes each.</w:t>
       </w:r>
     </w:p>
     <w:p>
@@ -1218,7 +1218,7 @@
         <w:t>Jim:</w:t>
       </w:r>
       <w:r>
-        <w:t xml:space="preserve"> Ben Smith’s company. Nothing turns up under “BAM”, and the only Ben Smith in BC real estate on record has no Starlight history.</w:t>
+        <w:t xml:space="preserve"> Ben Smith’s company; recorded as “BAM”, not found under that name.</w:t>
       </w:r>
     </w:p>
     <w:p>
@@ -1237,10 +1237,7 @@
         <w:t>Rory:</w:t>
       </w:r>
       <w:r>
-        <w:t xml:space="preserve"> </w:t>
-      </w:r>
-      <w:r>
-        <w:t>Ike’s surname at Perkins&amp;Will; no Ike or Isaac on their Vancouver staff list.</w:t>
+        <w:t xml:space="preserve"> Ike’s surname at Perkins&amp;Will.</w:t>
       </w:r>
     </w:p>
     <w:p>
@@ -1259,7 +1256,10 @@
         <w:t>Omar:</w:t>
       </w:r>
       <w:r>
-        <w:t xml:space="preserve"> the Colliers contact’s name, and whether she is at Colliers Project Leaders or Colliers International.</w:t>
+        <w:t xml:space="preserve"> </w:t>
+      </w:r>
+      <w:r>
+        <w:t>the Colliers contact’s name, and whether she is at Colliers Project Leaders or Colliers International.</w:t>
       </w:r>
     </w:p>
     <w:p>
@@ -1275,70 +1275,10 @@
           <w:b/>
           <w:bCs/>
         </w:rPr>
-        <w:t>Jim / JM:</w:t>
-      </w:r>
-      <w:r>
-        <w:t xml:space="preserve"> which Heather Lands building is our Block B and whether WHM holds A and C; which three teams are in Beedie’s Fraser Mills tryout.</w:t>
-      </w:r>
-    </w:p>
-    <w:p>
-      <w:pPr>
-        <w:pStyle w:val="Compact"/>
-        <w:numPr>
-          <w:ilvl w:val="0"/>
-          <w:numId w:val="5"/>
-        </w:numPr>
-      </w:pPr>
-      <w:r>
-        <w:rPr>
-          <w:b/>
-          <w:bCs/>
-        </w:rPr>
-        <w:t>Jim:</w:t>
-      </w:r>
-      <w:r>
-        <w:t xml:space="preserve"> is Trillium the Victoria seniors-housing operator Trillium Communities, and is there a “Sue” there.</w:t>
-      </w:r>
-    </w:p>
-    <w:p>
-      <w:pPr>
-        <w:pStyle w:val="Compact"/>
-        <w:numPr>
-          <w:ilvl w:val="0"/>
-          <w:numId w:val="5"/>
-        </w:numPr>
-      </w:pPr>
-      <w:r>
-        <w:rPr>
-          <w:b/>
-          <w:bCs/>
-        </w:rPr>
         <w:t>Conor:</w:t>
       </w:r>
       <w:r>
-        <w:t xml:space="preserve"> where Stefan Hertel went after Mission Group, and the “Kent Arroyo” </w:t>
-      </w:r>
-      <w:r>
-        <w:t>townhouses we lost, which two listens could not make out.</w:t>
-      </w:r>
-    </w:p>
-    <w:p>
-      <w:pPr>
-        <w:pStyle w:val="Compact"/>
-        <w:numPr>
-          <w:ilvl w:val="0"/>
-          <w:numId w:val="5"/>
-        </w:numPr>
-      </w:pPr>
-      <w:r>
-        <w:rPr>
-          <w:b/>
-          <w:bCs/>
-        </w:rPr>
-        <w:t>JB / John:</w:t>
-      </w:r>
-      <w:r>
-        <w:t xml:space="preserve"> who owns the Fraser Health list now, and its closing date.</w:t>
+        <w:t xml:space="preserve"> where Stefan Hertel went after Mission Group, and the name of the townhouse project we lost.</w:t>
       </w:r>
     </w:p>
     <w:p>
@@ -1611,7 +1551,7 @@
   <w:abstractNum w:abstractNumId="0" w15:restartNumberingAfterBreak="0">
     <w:nsid w:val="0000A990"/>
     <w:multiLevelType w:val="multilevel"/>
-    <w:tmpl w:val="0D92DDA8"/>
+    <w:tmpl w:val="6C88F870"/>
     <w:lvl w:ilvl="0">
       <w:numFmt w:val="bullet"/>
       <w:lvlText w:val=" "/>
@@ -1688,7 +1628,7 @@
   <w:abstractNum w:abstractNumId="1" w15:restartNumberingAfterBreak="0">
     <w:nsid w:val="0000A991"/>
     <w:multiLevelType w:val="multilevel"/>
-    <w:tmpl w:val="CC30F988"/>
+    <w:tmpl w:val="7DA6C8E8"/>
     <w:lvl w:ilvl="0">
       <w:numFmt w:val="bullet"/>
       <w:lvlText w:val=""/>
@@ -1792,7 +1732,7 @@
   <w:abstractNum w:abstractNumId="2" w15:restartNumberingAfterBreak="0">
     <w:nsid w:val="00A99411"/>
     <w:multiLevelType w:val="multilevel"/>
-    <w:tmpl w:val="AA04D0F4"/>
+    <w:tmpl w:val="130611FC"/>
     <w:lvl w:ilvl="0">
       <w:start w:val="1"/>
       <w:numFmt w:val="decimal"/>
@@ -1875,13 +1815,13 @@
       </w:pPr>
     </w:lvl>
   </w:abstractNum>
-  <w:num w:numId="1" w16cid:durableId="724255877">
+  <w:num w:numId="1" w16cid:durableId="1610628603">
     <w:abstractNumId w:val="0"/>
   </w:num>
-  <w:num w:numId="2" w16cid:durableId="960576696">
+  <w:num w:numId="2" w16cid:durableId="1076516316">
     <w:abstractNumId w:val="1"/>
   </w:num>
-  <w:num w:numId="3" w16cid:durableId="1941788727">
+  <w:num w:numId="3" w16cid:durableId="1597637139">
     <w:abstractNumId w:val="2"/>
     <w:lvlOverride w:ilvl="0">
       <w:startOverride w:val="1"/>
@@ -1911,10 +1851,10 @@
       <w:startOverride w:val="1"/>
     </w:lvlOverride>
   </w:num>
-  <w:num w:numId="4" w16cid:durableId="401636790">
+  <w:num w:numId="4" w16cid:durableId="1070078911">
     <w:abstractNumId w:val="1"/>
   </w:num>
-  <w:num w:numId="5" w16cid:durableId="2122413713">
+  <w:num w:numId="5" w16cid:durableId="1621035902">
     <w:abstractNumId w:val="1"/>
   </w:num>
 </w:numbering>
@@ -3145,7 +3085,7 @@
   <w:style w:type="table" w:styleId="TableGrid">
     <w:name w:val="Table Grid"/>
     <w:basedOn w:val="TableNormal"/>
-    <w:rsid w:val="00201A7E"/>
+    <w:rsid w:val="00E936A4"/>
     <w:pPr>
       <w:spacing w:after="0"/>
     </w:pPr>
@@ -3164,7 +3104,7 @@
     <w:name w:val="header"/>
     <w:basedOn w:val="Normal"/>
     <w:link w:val="HeaderChar"/>
-    <w:rsid w:val="00201A7E"/>
+    <w:rsid w:val="00E936A4"/>
     <w:pPr>
       <w:tabs>
         <w:tab w:val="center" w:pos="4680"/>
@@ -3177,7 +3117,7 @@
     <w:name w:val="Header Char"/>
     <w:basedOn w:val="DefaultParagraphFont"/>
     <w:link w:val="Header"/>
-    <w:rsid w:val="00201A7E"/>
+    <w:rsid w:val="00E936A4"/>
     <w:rPr>
       <w:rFonts w:ascii="Georgia" w:hAnsi="Georgia"/>
       <w:sz w:val="20"/>
@@ -3187,7 +3127,7 @@
     <w:name w:val="footer"/>
     <w:basedOn w:val="Normal"/>
     <w:link w:val="FooterChar"/>
-    <w:rsid w:val="00201A7E"/>
+    <w:rsid w:val="00E936A4"/>
     <w:pPr>
       <w:tabs>
         <w:tab w:val="center" w:pos="4680"/>
@@ -3200,7 +3140,7 @@
     <w:name w:val="Footer Char"/>
     <w:basedOn w:val="DefaultParagraphFont"/>
     <w:link w:val="Footer"/>
-    <w:rsid w:val="00201A7E"/>
+    <w:rsid w:val="00E936A4"/>
     <w:rPr>
       <w:rFonts w:ascii="Georgia" w:hAnsi="Georgia"/>
       <w:sz w:val="20"/>

</xml_diff>

<commit_message>
Owner by owner in plain sentences; Heather Lands stated in Jim's words, WHM on A and C kept as his understanding
The shorthand lines were unclear (Ian). The Port Authority contact sits under
Omar and JM, who share it. Block B is one of GBL's three blocks, not Parcel B.

Co-Authored-By: Claude Fable 5.1 <noreply@anthropic.com>
Claude-Session: https://claude.ai/code/session_01J55941tRFE1tGX63LJBUVG
</commit_message>
<xml_diff>
--- a/docs/BD-Vancouver-Updates-ExecSummary-2026-09-03.docx
+++ b/docs/BD-Vancouver-Updates-ExecSummary-2026-09-03.docx
@@ -1035,7 +1035,10 @@
         <w:t>Omar:</w:t>
       </w:r>
       <w:r>
-        <w:t xml:space="preserve"> the Colliers introductions, and ask Colliers what change-of-use work they see; NDY seismic-restraint referrals; the office-to-hotel seismic assessment (NDA, structural drawings, report fee) and the same offer to the Coal Harbour hotel developer; Stantec with Islam; with JM, the ex-employee contact at the Port Authority.</w:t>
+        <w:t xml:space="preserve"> </w:t>
+      </w:r>
+      <w:r>
+        <w:t>Take up the Colliers introductions, and ask Colliers what change-of-use work they are seeing. Chase the NDY referrals for seismic restraint work. Run the office-to-hotel seismic assessment: NDA first, then their structural drawings, then a fee for the report. Make the same offer to the Coal Harbour hotel developer. Pitch Stantec with Islam. With JM, follow up the contact who used to work at the Port Authority.</w:t>
       </w:r>
     </w:p>
     <w:p>
@@ -1055,10 +1058,10 @@
         <w:t>Jim:</w:t>
       </w:r>
       <w:r>
-        <w:t xml:space="preserve"> the </w:t>
-      </w:r>
-      <w:r>
-        <w:t>“no transfers” presentation; lunch with Giovanni Gunawan at Aquilini; the San Diego RFP this week; the CDA lunch on the 11th; a call to Michael De Cotiis at Pinnacle for lunch after the long weekend; check with Daler that MVE’s insurance update went back.</w:t>
+        <w:t xml:space="preserve"> Prepare the “designing without transfers” </w:t>
+      </w:r>
+      <w:r>
+        <w:t>presentation for Aquilini and GBL. Lunch with Giovanni Gunawan at Aquilini. Get the San Diego wood-frame RFP in this week. Lunch at CDA on the 11th with Omar. Call Michael De Cotiis at Pinnacle for lunch after the long weekend. Check with Daler that MVE’s insurance update went back.</w:t>
       </w:r>
     </w:p>
     <w:p>
@@ -1080,7 +1083,7 @@
         <w:t xml:space="preserve"> </w:t>
       </w:r>
       <w:r>
-        <w:t>call Gwyn Vose at Arcadis for lunch; confirm with Beedie whether we are in the Fraser Mills tryout (nobody was sure on the call); Calgary, with Anthem and GGA direct; the intro to Berry Architecture’s new Kelowna studio for Conor; call Brad Burnett at ITC. MCM is worth a visit and JM’s contact Peter Odegaard is a partner there.</w:t>
+        <w:t>Call Gwyn Vose at Arcadis for lunch. Confirm with Beedie whether we are one of the three Fraser Mills teams. Set up Calgary, reaching Anthem and GGA directly. Introduce Conor to Berry Architecture’s new Kelowna studio. Call Brad Burnett at ITC. With Omar, follow up the contact who used to work at the Port Authority. MCM is worth a visit; JM’s contact Peter Odegaard is a partner there.</w:t>
       </w:r>
     </w:p>
     <w:p>
@@ -1099,7 +1102,10 @@
         <w:t>JB:</w:t>
       </w:r>
       <w:r>
-        <w:t xml:space="preserve"> Bosa lunch with Colin via Robert, October; Solterra one-on-one with Gerry Nichele, the decision maker, this week or early next.</w:t>
+        <w:t xml:space="preserve"> </w:t>
+      </w:r>
+      <w:r>
+        <w:t>Lunch with Colin Bosa in October, set up through Robert. A one-on-one with Gerry Nichele, the decision maker at Solterra, this week or early next.</w:t>
       </w:r>
     </w:p>
     <w:p>
@@ -1118,10 +1124,7 @@
         <w:t>Rory:</w:t>
       </w:r>
       <w:r>
-        <w:t xml:space="preserve"> </w:t>
-      </w:r>
-      <w:r>
-        <w:t>Continuum Architecture, from Jim’s hand-over; ask Ike about the Perkins&amp;Will invite. The conversions blurb was his idea; Ian drafts it.</w:t>
+        <w:t xml:space="preserve"> Pick up Continuum Architecture from Jim. Ask Ike about the Perkins&amp;Will invite. The conversions blurb was Rory’s idea; Ian drafts it.</w:t>
       </w:r>
     </w:p>
     <w:p>
@@ -1140,7 +1143,7 @@
         <w:t>Islam:</w:t>
       </w:r>
       <w:r>
-        <w:t xml:space="preserve"> KRA’s Vancouver team; Stantec with Omar; JM’s Calgary meetings.</w:t>
+        <w:t xml:space="preserve"> Get in front of KRA’s Vancouver team. Pitch Stantec with Omar. Book JM’s Calgary meetings.</w:t>
       </w:r>
     </w:p>
     <w:p>
@@ -1159,7 +1162,10 @@
         <w:t>Conor:</w:t>
       </w:r>
       <w:r>
-        <w:t xml:space="preserve"> Graham night, and two more invites; press Lauren Macaulay at Arcadis Kelowna for the three developer intros; follow Mission Group’s departed contact, Stefan Hertel, to wherever he lands.</w:t>
+        <w:t xml:space="preserve"> </w:t>
+      </w:r>
+      <w:r>
+        <w:t>Graham night, and find two more invites. Press Lauren Macaulay at Arcadis Kelowna for the three developer introductions. Follow Stefan Hertel, who has left Mission Group, to wherever he lands.</w:t>
       </w:r>
     </w:p>
     <w:p>
@@ -1178,10 +1184,7 @@
         <w:t>Ian:</w:t>
       </w:r>
       <w:r>
-        <w:t xml:space="preserve"> </w:t>
-      </w:r>
-      <w:r>
-        <w:t>the architect target list and talking points; the events list; Port Authority recon; Island intel and Continuum contacts to Rory; the conversions blurb; Jim onto the app; Omar set up as gatekeeper; this recap.</w:t>
+        <w:t xml:space="preserve"> Build the architect target list and talking points. Keep the events list. Recon on the Port Authority. Send Rory the Island intel and the Continuum contacts. Draft the conversions blurb. Get Jim onto the app and set Omar up as gatekeeper. This recap.</w:t>
       </w:r>
     </w:p>
     <w:p>
@@ -1256,10 +1259,7 @@
         <w:t>Omar:</w:t>
       </w:r>
       <w:r>
-        <w:t xml:space="preserve"> </w:t>
-      </w:r>
-      <w:r>
-        <w:t>the Colliers contact’s name, and whether she is at Colliers Project Leaders or Colliers International.</w:t>
+        <w:t xml:space="preserve"> the Colliers contact’s name, and whether she is at Colliers Project Leaders or Colliers International.</w:t>
       </w:r>
     </w:p>
     <w:p>
@@ -1551,7 +1551,7 @@
   <w:abstractNum w:abstractNumId="0" w15:restartNumberingAfterBreak="0">
     <w:nsid w:val="0000A990"/>
     <w:multiLevelType w:val="multilevel"/>
-    <w:tmpl w:val="6C88F870"/>
+    <w:tmpl w:val="43EACE04"/>
     <w:lvl w:ilvl="0">
       <w:numFmt w:val="bullet"/>
       <w:lvlText w:val=" "/>
@@ -1628,7 +1628,7 @@
   <w:abstractNum w:abstractNumId="1" w15:restartNumberingAfterBreak="0">
     <w:nsid w:val="0000A991"/>
     <w:multiLevelType w:val="multilevel"/>
-    <w:tmpl w:val="7DA6C8E8"/>
+    <w:tmpl w:val="80666954"/>
     <w:lvl w:ilvl="0">
       <w:numFmt w:val="bullet"/>
       <w:lvlText w:val=""/>
@@ -1732,7 +1732,7 @@
   <w:abstractNum w:abstractNumId="2" w15:restartNumberingAfterBreak="0">
     <w:nsid w:val="00A99411"/>
     <w:multiLevelType w:val="multilevel"/>
-    <w:tmpl w:val="130611FC"/>
+    <w:tmpl w:val="BD1EAFCC"/>
     <w:lvl w:ilvl="0">
       <w:start w:val="1"/>
       <w:numFmt w:val="decimal"/>
@@ -1815,13 +1815,13 @@
       </w:pPr>
     </w:lvl>
   </w:abstractNum>
-  <w:num w:numId="1" w16cid:durableId="1610628603">
+  <w:num w:numId="1" w16cid:durableId="232669816">
     <w:abstractNumId w:val="0"/>
   </w:num>
-  <w:num w:numId="2" w16cid:durableId="1076516316">
+  <w:num w:numId="2" w16cid:durableId="1164471821">
     <w:abstractNumId w:val="1"/>
   </w:num>
-  <w:num w:numId="3" w16cid:durableId="1597637139">
+  <w:num w:numId="3" w16cid:durableId="389035481">
     <w:abstractNumId w:val="2"/>
     <w:lvlOverride w:ilvl="0">
       <w:startOverride w:val="1"/>
@@ -1851,10 +1851,10 @@
       <w:startOverride w:val="1"/>
     </w:lvlOverride>
   </w:num>
-  <w:num w:numId="4" w16cid:durableId="1070078911">
+  <w:num w:numId="4" w16cid:durableId="1319765398">
     <w:abstractNumId w:val="1"/>
   </w:num>
-  <w:num w:numId="5" w16cid:durableId="1621035902">
+  <w:num w:numId="5" w16cid:durableId="730425991">
     <w:abstractNumId w:val="1"/>
   </w:num>
 </w:numbering>
@@ -3085,7 +3085,7 @@
   <w:style w:type="table" w:styleId="TableGrid">
     <w:name w:val="Table Grid"/>
     <w:basedOn w:val="TableNormal"/>
-    <w:rsid w:val="00E936A4"/>
+    <w:rsid w:val="00D3636B"/>
     <w:pPr>
       <w:spacing w:after="0"/>
     </w:pPr>
@@ -3104,7 +3104,7 @@
     <w:name w:val="header"/>
     <w:basedOn w:val="Normal"/>
     <w:link w:val="HeaderChar"/>
-    <w:rsid w:val="00E936A4"/>
+    <w:rsid w:val="00D3636B"/>
     <w:pPr>
       <w:tabs>
         <w:tab w:val="center" w:pos="4680"/>
@@ -3117,7 +3117,7 @@
     <w:name w:val="Header Char"/>
     <w:basedOn w:val="DefaultParagraphFont"/>
     <w:link w:val="Header"/>
-    <w:rsid w:val="00E936A4"/>
+    <w:rsid w:val="00D3636B"/>
     <w:rPr>
       <w:rFonts w:ascii="Georgia" w:hAnsi="Georgia"/>
       <w:sz w:val="20"/>
@@ -3127,7 +3127,7 @@
     <w:name w:val="footer"/>
     <w:basedOn w:val="Normal"/>
     <w:link w:val="FooterChar"/>
-    <w:rsid w:val="00E936A4"/>
+    <w:rsid w:val="00D3636B"/>
     <w:pPr>
       <w:tabs>
         <w:tab w:val="center" w:pos="4680"/>
@@ -3140,7 +3140,7 @@
     <w:name w:val="Footer Char"/>
     <w:basedOn w:val="DefaultParagraphFont"/>
     <w:link w:val="Footer"/>
-    <w:rsid w:val="00E936A4"/>
+    <w:rsid w:val="00D3636B"/>
     <w:rPr>
       <w:rFonts w:ascii="Georgia" w:hAnsi="Georgia"/>
       <w:sz w:val="20"/>

</xml_diff>

<commit_message>
No Unknowns section in the email: nothing on the list stalls an action, so each is a CRM gap for Ian to close one-to-one
Ian's test: do we NEED to know. Stefan Hertel was a throwaway line by Conor; his
career history sits on the CRM row for whenever the new firm surfaces.

Co-Authored-By: Claude Fable 5.1 <noreply@anthropic.com>
Claude-Session: https://claude.ai/code/session_01J55941tRFE1tGX63LJBUVG
</commit_message>
<xml_diff>
--- a/docs/BD-Vancouver-Updates-ExecSummary-2026-09-03.docx
+++ b/docs/BD-Vancouver-Updates-ExecSummary-2026-09-03.docx
@@ -1189,100 +1189,6 @@
     </w:p>
     <w:p>
       <w:pPr>
-        <w:pStyle w:val="Heading2"/>
-      </w:pPr>
-      <w:bookmarkStart w:id="6" w:name="unknowns"/>
-      <w:bookmarkEnd w:id="5"/>
-      <w:r>
-        <w:t>Unknowns</w:t>
-      </w:r>
-    </w:p>
-    <w:p>
-      <w:pPr>
-        <w:pStyle w:val="FirstParagraph"/>
-      </w:pPr>
-      <w:r>
-        <w:t>Four things from the call not yet pinned down. A one-line reply from the owner closes each.</w:t>
-      </w:r>
-    </w:p>
-    <w:p>
-      <w:pPr>
-        <w:pStyle w:val="Compact"/>
-        <w:numPr>
-          <w:ilvl w:val="0"/>
-          <w:numId w:val="5"/>
-        </w:numPr>
-      </w:pPr>
-      <w:r>
-        <w:rPr>
-          <w:b/>
-          <w:bCs/>
-        </w:rPr>
-        <w:t>Jim:</w:t>
-      </w:r>
-      <w:r>
-        <w:t xml:space="preserve"> Ben Smith’s company; recorded as “BAM”, not found under that name.</w:t>
-      </w:r>
-    </w:p>
-    <w:p>
-      <w:pPr>
-        <w:pStyle w:val="Compact"/>
-        <w:numPr>
-          <w:ilvl w:val="0"/>
-          <w:numId w:val="5"/>
-        </w:numPr>
-      </w:pPr>
-      <w:r>
-        <w:rPr>
-          <w:b/>
-          <w:bCs/>
-        </w:rPr>
-        <w:t>Rory:</w:t>
-      </w:r>
-      <w:r>
-        <w:t xml:space="preserve"> Ike’s surname at Perkins&amp;Will.</w:t>
-      </w:r>
-    </w:p>
-    <w:p>
-      <w:pPr>
-        <w:pStyle w:val="Compact"/>
-        <w:numPr>
-          <w:ilvl w:val="0"/>
-          <w:numId w:val="5"/>
-        </w:numPr>
-      </w:pPr>
-      <w:r>
-        <w:rPr>
-          <w:b/>
-          <w:bCs/>
-        </w:rPr>
-        <w:t>Omar:</w:t>
-      </w:r>
-      <w:r>
-        <w:t xml:space="preserve"> the Colliers contact’s name, and whether she is at Colliers Project Leaders or Colliers International.</w:t>
-      </w:r>
-    </w:p>
-    <w:p>
-      <w:pPr>
-        <w:pStyle w:val="Compact"/>
-        <w:numPr>
-          <w:ilvl w:val="0"/>
-          <w:numId w:val="5"/>
-        </w:numPr>
-      </w:pPr>
-      <w:r>
-        <w:rPr>
-          <w:b/>
-          <w:bCs/>
-        </w:rPr>
-        <w:t>Conor:</w:t>
-      </w:r>
-      <w:r>
-        <w:t xml:space="preserve"> where Stefan Hertel went after Mission Group, and the name of the townhouse project we lost.</w:t>
-      </w:r>
-    </w:p>
-    <w:p>
-      <w:pPr>
         <w:pStyle w:val="FirstParagraph"/>
       </w:pPr>
       <w:r>
@@ -1293,7 +1199,7 @@
         <w:t>Full synopsis with contacts, org history and the app’s existing records: see Ian.</w:t>
       </w:r>
       <w:bookmarkEnd w:id="0"/>
-      <w:bookmarkEnd w:id="6"/>
+      <w:bookmarkEnd w:id="5"/>
     </w:p>
     <w:sectPr>
       <w:headerReference w:type="even" r:id="rId7"/>
@@ -1551,7 +1457,7 @@
   <w:abstractNum w:abstractNumId="0" w15:restartNumberingAfterBreak="0">
     <w:nsid w:val="0000A990"/>
     <w:multiLevelType w:val="multilevel"/>
-    <w:tmpl w:val="43EACE04"/>
+    <w:tmpl w:val="6DFCE01A"/>
     <w:lvl w:ilvl="0">
       <w:numFmt w:val="bullet"/>
       <w:lvlText w:val=" "/>
@@ -1628,7 +1534,7 @@
   <w:abstractNum w:abstractNumId="1" w15:restartNumberingAfterBreak="0">
     <w:nsid w:val="0000A991"/>
     <w:multiLevelType w:val="multilevel"/>
-    <w:tmpl w:val="80666954"/>
+    <w:tmpl w:val="D5E40918"/>
     <w:lvl w:ilvl="0">
       <w:numFmt w:val="bullet"/>
       <w:lvlText w:val=""/>
@@ -1732,7 +1638,7 @@
   <w:abstractNum w:abstractNumId="2" w15:restartNumberingAfterBreak="0">
     <w:nsid w:val="00A99411"/>
     <w:multiLevelType w:val="multilevel"/>
-    <w:tmpl w:val="BD1EAFCC"/>
+    <w:tmpl w:val="D90C4D86"/>
     <w:lvl w:ilvl="0">
       <w:start w:val="1"/>
       <w:numFmt w:val="decimal"/>
@@ -1815,13 +1721,13 @@
       </w:pPr>
     </w:lvl>
   </w:abstractNum>
-  <w:num w:numId="1" w16cid:durableId="232669816">
+  <w:num w:numId="1" w16cid:durableId="2136213465">
     <w:abstractNumId w:val="0"/>
   </w:num>
-  <w:num w:numId="2" w16cid:durableId="1164471821">
+  <w:num w:numId="2" w16cid:durableId="567302331">
     <w:abstractNumId w:val="1"/>
   </w:num>
-  <w:num w:numId="3" w16cid:durableId="389035481">
+  <w:num w:numId="3" w16cid:durableId="1132986819">
     <w:abstractNumId w:val="2"/>
     <w:lvlOverride w:ilvl="0">
       <w:startOverride w:val="1"/>
@@ -1851,10 +1757,7 @@
       <w:startOverride w:val="1"/>
     </w:lvlOverride>
   </w:num>
-  <w:num w:numId="4" w16cid:durableId="1319765398">
-    <w:abstractNumId w:val="1"/>
-  </w:num>
-  <w:num w:numId="5" w16cid:durableId="730425991">
+  <w:num w:numId="4" w16cid:durableId="605427179">
     <w:abstractNumId w:val="1"/>
   </w:num>
 </w:numbering>
@@ -3085,7 +2988,7 @@
   <w:style w:type="table" w:styleId="TableGrid">
     <w:name w:val="Table Grid"/>
     <w:basedOn w:val="TableNormal"/>
-    <w:rsid w:val="00D3636B"/>
+    <w:rsid w:val="0040565A"/>
     <w:pPr>
       <w:spacing w:after="0"/>
     </w:pPr>
@@ -3104,7 +3007,7 @@
     <w:name w:val="header"/>
     <w:basedOn w:val="Normal"/>
     <w:link w:val="HeaderChar"/>
-    <w:rsid w:val="00D3636B"/>
+    <w:rsid w:val="0040565A"/>
     <w:pPr>
       <w:tabs>
         <w:tab w:val="center" w:pos="4680"/>
@@ -3117,7 +3020,7 @@
     <w:name w:val="Header Char"/>
     <w:basedOn w:val="DefaultParagraphFont"/>
     <w:link w:val="Header"/>
-    <w:rsid w:val="00D3636B"/>
+    <w:rsid w:val="0040565A"/>
     <w:rPr>
       <w:rFonts w:ascii="Georgia" w:hAnsi="Georgia"/>
       <w:sz w:val="20"/>
@@ -3127,7 +3030,7 @@
     <w:name w:val="footer"/>
     <w:basedOn w:val="Normal"/>
     <w:link w:val="FooterChar"/>
-    <w:rsid w:val="00D3636B"/>
+    <w:rsid w:val="0040565A"/>
     <w:pPr>
       <w:tabs>
         <w:tab w:val="center" w:pos="4680"/>
@@ -3140,7 +3043,7 @@
     <w:name w:val="Footer Char"/>
     <w:basedOn w:val="DefaultParagraphFont"/>
     <w:link w:val="Footer"/>
-    <w:rsid w:val="00D3636B"/>
+    <w:rsid w:val="0040565A"/>
     <w:rPr>
       <w:rFonts w:ascii="Georgia" w:hAnsi="Georgia"/>
       <w:sz w:val="20"/>

</xml_diff>

<commit_message>
The California bullet says what happened in San Diego and with MVE in plain words
Co-Authored-By: Claude Fable 5.1 <noreply@anthropic.com>
Claude-Session: https://claude.ai/code/session_01J55941tRFE1tGX63LJBUVG
</commit_message>
<xml_diff>
--- a/docs/BD-Vancouver-Updates-ExecSummary-2026-09-03.docx
+++ b/docs/BD-Vancouver-Updates-ExecSummary-2026-09-03.docx
@@ -268,7 +268,40 @@
         <w:t>California.</w:t>
       </w:r>
       <w:r>
-        <w:t xml:space="preserve"> A US$1M three-tower proposal in San Diego turned out to be leverage against an incumbent; a wood-frame RFP goes in this week. MVE (Irvine) responded well to the AI demo and has asked for updated insurance; visit around the LA Tall Building Conference in November.</w:t>
+        <w:t xml:space="preserve"> On an architect’s referral, Jim put a </w:t>
+      </w:r>
+      <w:r>
+        <w:rPr>
+          <w:b/>
+          <w:bCs/>
+        </w:rPr>
+        <w:t>US$1M fee proposal</w:t>
+      </w:r>
+      <w:r>
+        <w:t xml:space="preserve"> on three towers in San Diego. The owner then would not meet him, and it looks like they used our number to squeeze the structural engineer they had already chosen. Not won, but proof the referrals work. A separate </w:t>
+      </w:r>
+      <w:r>
+        <w:rPr>
+          <w:b/>
+          <w:bCs/>
+        </w:rPr>
+        <w:t>wood-frame RFP</w:t>
+      </w:r>
+      <w:r>
+        <w:t xml:space="preserve"> </w:t>
+      </w:r>
+      <w:r>
+        <w:t xml:space="preserve">for San Diego goes in this week. </w:t>
+      </w:r>
+      <w:r>
+        <w:rPr>
+          <w:b/>
+          <w:bCs/>
+        </w:rPr>
+        <w:t>MVE</w:t>
+      </w:r>
+      <w:r>
+        <w:t>, an architect in Irvine we have worked with before, responded well to the AI demo Jim and Ian gave their BD lead, then asked us to update our insurance with them, which Jim reads as keeping us qualified. Jim or JM will visit them around the LA Tall Building Conference in November.</w:t>
       </w:r>
     </w:p>
     <w:p>
@@ -287,10 +320,7 @@
         <w:t>Market read.</w:t>
       </w:r>
       <w:r>
-        <w:t xml:space="preserve"> </w:t>
-      </w:r>
-      <w:r>
-        <w:t>Concrete high-rise is in a holding pattern; Rize’s Cambie and Marine tower is stalled on offshore capital. “Hopefully next year” is what everyone is hearing.</w:t>
+        <w:t xml:space="preserve"> Concrete high-rise is in a holding pattern; Rize’s Cambie and Marine tower is stalled on offshore capital. “Hopefully next year” is what everyone is hearing.</w:t>
       </w:r>
     </w:p>
     <w:p>
@@ -300,6 +330,7 @@
       <w:bookmarkStart w:id="3" w:name="decisions"/>
       <w:bookmarkEnd w:id="2"/>
       <w:r>
+        <w:lastRenderedPageBreak/>
         <w:t>Decisions</w:t>
       </w:r>
     </w:p>
@@ -338,14 +369,10 @@
           <w:b/>
           <w:bCs/>
         </w:rPr>
-        <w:lastRenderedPageBreak/>
         <w:t>Seismic assessments and change-of-use work</w:t>
       </w:r>
       <w:r>
-        <w:t xml:space="preserve"> </w:t>
-      </w:r>
-      <w:r>
-        <w:t>(office to hotel or residential, S3 bylaw thresholds) become a promoted service line. Quote the report only; the upgrade work follows. Rory suggested a website and LinkedIn blurb, Ian will draft it; Omar raises it with Colliers as the thing we can do for them.</w:t>
+        <w:t xml:space="preserve"> (office to hotel or residential, S3 bylaw thresholds) become a promoted service line. Quote the report only; the upgrade work follows. Rory suggested a website and LinkedIn blurb, Ian will draft it; Omar raises it with Colliers as the thing we can do for them.</w:t>
       </w:r>
     </w:p>
     <w:p>
@@ -1016,6 +1043,7 @@
       <w:bookmarkStart w:id="5" w:name="owner-by-owner"/>
       <w:bookmarkEnd w:id="4"/>
       <w:r>
+        <w:lastRenderedPageBreak/>
         <w:t>Owner by owner</w:t>
       </w:r>
     </w:p>
@@ -1054,7 +1082,6 @@
           <w:b/>
           <w:bCs/>
         </w:rPr>
-        <w:lastRenderedPageBreak/>
         <w:t>Jim:</w:t>
       </w:r>
       <w:r>
@@ -1457,7 +1484,7 @@
   <w:abstractNum w:abstractNumId="0" w15:restartNumberingAfterBreak="0">
     <w:nsid w:val="0000A990"/>
     <w:multiLevelType w:val="multilevel"/>
-    <w:tmpl w:val="6DFCE01A"/>
+    <w:tmpl w:val="C48A6BD6"/>
     <w:lvl w:ilvl="0">
       <w:numFmt w:val="bullet"/>
       <w:lvlText w:val=" "/>
@@ -1534,7 +1561,7 @@
   <w:abstractNum w:abstractNumId="1" w15:restartNumberingAfterBreak="0">
     <w:nsid w:val="0000A991"/>
     <w:multiLevelType w:val="multilevel"/>
-    <w:tmpl w:val="D5E40918"/>
+    <w:tmpl w:val="495E0B84"/>
     <w:lvl w:ilvl="0">
       <w:numFmt w:val="bullet"/>
       <w:lvlText w:val=""/>
@@ -1638,7 +1665,7 @@
   <w:abstractNum w:abstractNumId="2" w15:restartNumberingAfterBreak="0">
     <w:nsid w:val="00A99411"/>
     <w:multiLevelType w:val="multilevel"/>
-    <w:tmpl w:val="D90C4D86"/>
+    <w:tmpl w:val="ACD849D2"/>
     <w:lvl w:ilvl="0">
       <w:start w:val="1"/>
       <w:numFmt w:val="decimal"/>
@@ -1721,13 +1748,13 @@
       </w:pPr>
     </w:lvl>
   </w:abstractNum>
-  <w:num w:numId="1" w16cid:durableId="2136213465">
+  <w:num w:numId="1" w16cid:durableId="913970343">
     <w:abstractNumId w:val="0"/>
   </w:num>
-  <w:num w:numId="2" w16cid:durableId="567302331">
+  <w:num w:numId="2" w16cid:durableId="926187333">
     <w:abstractNumId w:val="1"/>
   </w:num>
-  <w:num w:numId="3" w16cid:durableId="1132986819">
+  <w:num w:numId="3" w16cid:durableId="1808621062">
     <w:abstractNumId w:val="2"/>
     <w:lvlOverride w:ilvl="0">
       <w:startOverride w:val="1"/>
@@ -1757,7 +1784,7 @@
       <w:startOverride w:val="1"/>
     </w:lvlOverride>
   </w:num>
-  <w:num w:numId="4" w16cid:durableId="605427179">
+  <w:num w:numId="4" w16cid:durableId="1451582654">
     <w:abstractNumId w:val="1"/>
   </w:num>
 </w:numbering>
@@ -2988,7 +3015,7 @@
   <w:style w:type="table" w:styleId="TableGrid">
     <w:name w:val="Table Grid"/>
     <w:basedOn w:val="TableNormal"/>
-    <w:rsid w:val="0040565A"/>
+    <w:rsid w:val="00472451"/>
     <w:pPr>
       <w:spacing w:after="0"/>
     </w:pPr>
@@ -3007,7 +3034,7 @@
     <w:name w:val="header"/>
     <w:basedOn w:val="Normal"/>
     <w:link w:val="HeaderChar"/>
-    <w:rsid w:val="0040565A"/>
+    <w:rsid w:val="00472451"/>
     <w:pPr>
       <w:tabs>
         <w:tab w:val="center" w:pos="4680"/>
@@ -3020,7 +3047,7 @@
     <w:name w:val="Header Char"/>
     <w:basedOn w:val="DefaultParagraphFont"/>
     <w:link w:val="Header"/>
-    <w:rsid w:val="0040565A"/>
+    <w:rsid w:val="00472451"/>
     <w:rPr>
       <w:rFonts w:ascii="Georgia" w:hAnsi="Georgia"/>
       <w:sz w:val="20"/>
@@ -3030,7 +3057,7 @@
     <w:name w:val="footer"/>
     <w:basedOn w:val="Normal"/>
     <w:link w:val="FooterChar"/>
-    <w:rsid w:val="0040565A"/>
+    <w:rsid w:val="00472451"/>
     <w:pPr>
       <w:tabs>
         <w:tab w:val="center" w:pos="4680"/>
@@ -3043,7 +3070,7 @@
     <w:name w:val="Footer Char"/>
     <w:basedOn w:val="DefaultParagraphFont"/>
     <w:link w:val="Footer"/>
-    <w:rsid w:val="0040565A"/>
+    <w:rsid w:val="00472451"/>
     <w:rPr>
       <w:rFonts w:ascii="Georgia" w:hAnsi="Georgia"/>
       <w:sz w:val="20"/>

</xml_diff>

<commit_message>
The extra claim is named for what it is, a claim for extra fees on Block B; the call was on a Thursday
Co-Authored-By: Claude Fable 5.1 <noreply@anthropic.com>
Claude-Session: https://claude.ai/code/session_01J55941tRFE1tGX63LJBUVG
</commit_message>
<xml_diff>
--- a/docs/BD-Vancouver-Updates-ExecSummary-2026-09-03.docx
+++ b/docs/BD-Vancouver-Updates-ExecSummary-2026-09-03.docx
@@ -146,40 +146,47 @@
         <w:t>Heather Lands.</w:t>
       </w:r>
       <w:r>
-        <w:t xml:space="preserve"> After our extra claim got Aquilini’s attention, Jim met GBL’s Thomas Lee. KOR has Block B; Aquilini has said we get a shot at </w:t>
+        <w:t xml:space="preserve"> On Friday 28 August KOR submitted a claim to Aquilini for </w:t>
       </w:r>
       <w:r>
         <w:rPr>
           <w:b/>
           <w:bCs/>
         </w:rPr>
-        <w:t>Block A</w:t>
-      </w:r>
-      <w:r>
-        <w:t xml:space="preserve"> (growing into a large tower) and we are going after </w:t>
+        <w:t>extra fees on Block B</w:t>
+      </w:r>
+      <w:r>
+        <w:t xml:space="preserve">, for work beyond scope. It got everyone’s attention, including GBL, and Aquilini told GBL’s Thomas Lee to meet Jim; they had coffee on Wednesday. GBL is doing three blocks there. KOR is on Block B, Aquilini has said we get a shot at </w:t>
       </w:r>
       <w:r>
         <w:rPr>
           <w:b/>
           <w:bCs/>
         </w:rPr>
-        <w:t>Block C</w:t>
-      </w:r>
-      <w:r>
-        <w:t xml:space="preserve"> too. Jim is preparing a </w:t>
+        <w:t>Block A</w:t>
+      </w:r>
+      <w:r>
+        <w:t xml:space="preserve"> (growing into a large tower), and we are going after </w:t>
       </w:r>
       <w:r>
         <w:rPr>
           <w:b/>
           <w:bCs/>
         </w:rPr>
+        <w:t>Block C</w:t>
+      </w:r>
+      <w:r>
+        <w:t xml:space="preserve"> too. Jim is preparing a </w:t>
+      </w:r>
+      <w:r>
+        <w:rPr>
+          <w:b/>
+          <w:bCs/>
+        </w:rPr>
         <w:t>“designing without transfers”</w:t>
       </w:r>
       <w:r>
-        <w:t xml:space="preserve"> </w:t>
-      </w:r>
-      <w:r>
-        <w:t>presentation for Aquilini’s and GBL’s offices, with JM and Omar.</w:t>
+        <w:t xml:space="preserve"> presentation for Aquilini’s and GBL’s offices, with JM and Omar.</w:t>
       </w:r>
     </w:p>
     <w:p>
@@ -198,7 +205,10 @@
         <w:t>Beedie / Fraser Mills.</w:t>
       </w:r>
       <w:r>
-        <w:t xml:space="preserve"> Three parcels, three teams, a tryout. JM to confirm whether we are one of the three.</w:t>
+        <w:t xml:space="preserve"> </w:t>
+      </w:r>
+      <w:r>
+        <w:t>Three parcels, three teams, a tryout. JM to confirm whether we are one of the three.</w:t>
       </w:r>
     </w:p>
     <w:p>
@@ -317,6 +327,7 @@
           <w:b/>
           <w:bCs/>
         </w:rPr>
+        <w:lastRenderedPageBreak/>
         <w:t>Market read.</w:t>
       </w:r>
       <w:r>
@@ -330,7 +341,6 @@
       <w:bookmarkStart w:id="3" w:name="decisions"/>
       <w:bookmarkEnd w:id="2"/>
       <w:r>
-        <w:lastRenderedPageBreak/>
         <w:t>Decisions</w:t>
       </w:r>
     </w:p>
@@ -1484,7 +1494,7 @@
   <w:abstractNum w:abstractNumId="0" w15:restartNumberingAfterBreak="0">
     <w:nsid w:val="0000A990"/>
     <w:multiLevelType w:val="multilevel"/>
-    <w:tmpl w:val="C48A6BD6"/>
+    <w:tmpl w:val="388CE612"/>
     <w:lvl w:ilvl="0">
       <w:numFmt w:val="bullet"/>
       <w:lvlText w:val=" "/>
@@ -1561,7 +1571,7 @@
   <w:abstractNum w:abstractNumId="1" w15:restartNumberingAfterBreak="0">
     <w:nsid w:val="0000A991"/>
     <w:multiLevelType w:val="multilevel"/>
-    <w:tmpl w:val="495E0B84"/>
+    <w:tmpl w:val="E2209D50"/>
     <w:lvl w:ilvl="0">
       <w:numFmt w:val="bullet"/>
       <w:lvlText w:val=""/>
@@ -1665,7 +1675,7 @@
   <w:abstractNum w:abstractNumId="2" w15:restartNumberingAfterBreak="0">
     <w:nsid w:val="00A99411"/>
     <w:multiLevelType w:val="multilevel"/>
-    <w:tmpl w:val="ACD849D2"/>
+    <w:tmpl w:val="D9F64560"/>
     <w:lvl w:ilvl="0">
       <w:start w:val="1"/>
       <w:numFmt w:val="decimal"/>
@@ -1748,13 +1758,13 @@
       </w:pPr>
     </w:lvl>
   </w:abstractNum>
-  <w:num w:numId="1" w16cid:durableId="913970343">
+  <w:num w:numId="1" w16cid:durableId="2015063813">
     <w:abstractNumId w:val="0"/>
   </w:num>
-  <w:num w:numId="2" w16cid:durableId="926187333">
+  <w:num w:numId="2" w16cid:durableId="1586645043">
     <w:abstractNumId w:val="1"/>
   </w:num>
-  <w:num w:numId="3" w16cid:durableId="1808621062">
+  <w:num w:numId="3" w16cid:durableId="2139376169">
     <w:abstractNumId w:val="2"/>
     <w:lvlOverride w:ilvl="0">
       <w:startOverride w:val="1"/>
@@ -1784,7 +1794,7 @@
       <w:startOverride w:val="1"/>
     </w:lvlOverride>
   </w:num>
-  <w:num w:numId="4" w16cid:durableId="1451582654">
+  <w:num w:numId="4" w16cid:durableId="328096291">
     <w:abstractNumId w:val="1"/>
   </w:num>
 </w:numbering>
@@ -3015,7 +3025,7 @@
   <w:style w:type="table" w:styleId="TableGrid">
     <w:name w:val="Table Grid"/>
     <w:basedOn w:val="TableNormal"/>
-    <w:rsid w:val="00472451"/>
+    <w:rsid w:val="00DF7683"/>
     <w:pPr>
       <w:spacing w:after="0"/>
     </w:pPr>
@@ -3034,7 +3044,7 @@
     <w:name w:val="header"/>
     <w:basedOn w:val="Normal"/>
     <w:link w:val="HeaderChar"/>
-    <w:rsid w:val="00472451"/>
+    <w:rsid w:val="00DF7683"/>
     <w:pPr>
       <w:tabs>
         <w:tab w:val="center" w:pos="4680"/>
@@ -3047,7 +3057,7 @@
     <w:name w:val="Header Char"/>
     <w:basedOn w:val="DefaultParagraphFont"/>
     <w:link w:val="Header"/>
-    <w:rsid w:val="00472451"/>
+    <w:rsid w:val="00DF7683"/>
     <w:rPr>
       <w:rFonts w:ascii="Georgia" w:hAnsi="Georgia"/>
       <w:sz w:val="20"/>
@@ -3057,7 +3067,7 @@
     <w:name w:val="footer"/>
     <w:basedOn w:val="Normal"/>
     <w:link w:val="FooterChar"/>
-    <w:rsid w:val="00472451"/>
+    <w:rsid w:val="00DF7683"/>
     <w:pPr>
       <w:tabs>
         <w:tab w:val="center" w:pos="4680"/>
@@ -3070,7 +3080,7 @@
     <w:name w:val="Footer Char"/>
     <w:basedOn w:val="DefaultParagraphFont"/>
     <w:link w:val="Footer"/>
-    <w:rsid w:val="00472451"/>
+    <w:rsid w:val="00DF7683"/>
     <w:rPr>
       <w:rFonts w:ascii="Georgia" w:hAnsi="Georgia"/>
       <w:sz w:val="20"/>

</xml_diff>

<commit_message>
Rory's Continuum line says what to do and with whose names; NDY, KRA and the events list spelled out the same way
Co-Authored-By: Claude Fable 5.1 <noreply@anthropic.com>
Claude-Session: https://claude.ai/code/session_01J55941tRFE1tGX63LJBUVG
</commit_message>
<xml_diff>
--- a/docs/BD-Vancouver-Updates-ExecSummary-2026-09-03.docx
+++ b/docs/BD-Vancouver-Updates-ExecSummary-2026-09-03.docx
@@ -1076,7 +1076,10 @@
         <w:t xml:space="preserve"> </w:t>
       </w:r>
       <w:r>
-        <w:t>Take up the Colliers introductions, and ask Colliers what change-of-use work they are seeing. Chase the NDY referrals for seismic restraint work. Run the office-to-hotel seismic assessment: NDA first, then their structural drawings, then a fee for the report. Make the same offer to the Coal Harbour hotel developer. Pitch Stantec with Islam. With JM, follow up the contact who used to work at the Port Authority.</w:t>
+        <w:t>Take up the Colliers introductions, and ask Colliers what change-of-use work they are seeing. Keep on his contact at NDY, the mechanical engineer who will recommend KOR for seismic restraint on his tenant-improvement jobs when nobody else is on board. Run the office-to-hotel seismic assessment: NDA first, then their structural drawings, then a fee for the report. Make the same offer to the Coal Harbour hotel developer. Pitch Stantec with Islam. With JM, follow up the contact who used to work at the Port Aut</w:t>
+      </w:r>
+      <w:r>
+        <w:t>hority.</w:t>
       </w:r>
     </w:p>
     <w:p>
@@ -1095,10 +1098,7 @@
         <w:t>Jim:</w:t>
       </w:r>
       <w:r>
-        <w:t xml:space="preserve"> Prepare the “designing without transfers” </w:t>
-      </w:r>
-      <w:r>
-        <w:t>presentation for Aquilini and GBL. Lunch with Giovanni Gunawan at Aquilini. Get the San Diego wood-frame RFP in this week. Lunch at CDA on the 11th with Omar. Call Michael De Cotiis at Pinnacle for lunch after the long weekend. Check with Daler that MVE’s insurance update went back.</w:t>
+        <w:t xml:space="preserve"> Prepare the “designing without transfers” presentation for Aquilini and GBL. Lunch with Giovanni Gunawan at Aquilini. Get the San Diego wood-frame RFP in this week. Lunch at CDA on the 11th with Omar. Call Michael De Cotiis at Pinnacle for lunch after the long weekend. Check with Daler that MVE’s insurance update went back.</w:t>
       </w:r>
     </w:p>
     <w:p>
@@ -1161,7 +1161,7 @@
         <w:t>Rory:</w:t>
       </w:r>
       <w:r>
-        <w:t xml:space="preserve"> Pick up Continuum Architecture from Jim. Ask Ike about the Perkins&amp;Will invite. The conversions blurb was Rory’s idea; Ian drafts it.</w:t>
+        <w:t xml:space="preserve"> Go and see Continuum Architecture in Victoria. Ben Smith gave Jim two names there as a soft intro, Jeremy Beintema, a principal, and Gregory Eeman, the two working on the Trillium job KOR proposed on; Jim has put them in the spreadsheet. Ask Ike about the Perkins&amp;Will invite. The conversions blurb was Rory’s idea; Ian drafts it.</w:t>
       </w:r>
     </w:p>
     <w:p>
@@ -1180,7 +1180,10 @@
         <w:t>Islam:</w:t>
       </w:r>
       <w:r>
-        <w:t xml:space="preserve"> Get in front of KRA’s Vancouver team. Pitch Stantec with Omar. Book JM’s Calgary meetings.</w:t>
+        <w:t xml:space="preserve"> </w:t>
+      </w:r>
+      <w:r>
+        <w:t>Set up the meeting with KRA’s Vancouver team, the healthcare architects Islam met in Edmonton. Pitch Stantec with Omar. Book JM’s Calgary meetings.</w:t>
       </w:r>
     </w:p>
     <w:p>
@@ -1199,10 +1202,7 @@
         <w:t>Conor:</w:t>
       </w:r>
       <w:r>
-        <w:t xml:space="preserve"> </w:t>
-      </w:r>
-      <w:r>
-        <w:t>Graham night, and find two more invites. Press Lauren Macaulay at Arcadis Kelowna for the three developer introductions. Follow Stefan Hertel, who has left Mission Group, to wherever he lands.</w:t>
+        <w:t xml:space="preserve"> Graham night, and find two more invites. Press Lauren Macaulay at Arcadis Kelowna for the three developer introductions. Follow Stefan Hertel, who has left Mission Group, to wherever he lands.</w:t>
       </w:r>
     </w:p>
     <w:p>
@@ -1221,7 +1221,10 @@
         <w:t>Ian:</w:t>
       </w:r>
       <w:r>
-        <w:t xml:space="preserve"> Build the architect target list and talking points. Keep the events list. Recon on the Port Authority. Send Rory the Island intel and the Continuum contacts. Draft the conversions blurb. Get Jim onto the app and set Omar up as gatekeeper. This recap.</w:t>
+        <w:t xml:space="preserve"> </w:t>
+      </w:r>
+      <w:r>
+        <w:t>Build the architect target list and talking points. Send Omar a list of events worth showing up at to bump into these people. Recon on the Port Authority. Send Rory the Island intel and the Continuum contacts. Draft the conversions blurb. Get Jim onto the app and set Omar up as gatekeeper. This recap.</w:t>
       </w:r>
     </w:p>
     <w:p>
@@ -1494,7 +1497,7 @@
   <w:abstractNum w:abstractNumId="0" w15:restartNumberingAfterBreak="0">
     <w:nsid w:val="0000A990"/>
     <w:multiLevelType w:val="multilevel"/>
-    <w:tmpl w:val="388CE612"/>
+    <w:tmpl w:val="19A088EC"/>
     <w:lvl w:ilvl="0">
       <w:numFmt w:val="bullet"/>
       <w:lvlText w:val=" "/>
@@ -1571,7 +1574,7 @@
   <w:abstractNum w:abstractNumId="1" w15:restartNumberingAfterBreak="0">
     <w:nsid w:val="0000A991"/>
     <w:multiLevelType w:val="multilevel"/>
-    <w:tmpl w:val="E2209D50"/>
+    <w:tmpl w:val="ED8CCC20"/>
     <w:lvl w:ilvl="0">
       <w:numFmt w:val="bullet"/>
       <w:lvlText w:val=""/>
@@ -1675,7 +1678,7 @@
   <w:abstractNum w:abstractNumId="2" w15:restartNumberingAfterBreak="0">
     <w:nsid w:val="00A99411"/>
     <w:multiLevelType w:val="multilevel"/>
-    <w:tmpl w:val="D9F64560"/>
+    <w:tmpl w:val="B7781174"/>
     <w:lvl w:ilvl="0">
       <w:start w:val="1"/>
       <w:numFmt w:val="decimal"/>
@@ -1758,13 +1761,13 @@
       </w:pPr>
     </w:lvl>
   </w:abstractNum>
-  <w:num w:numId="1" w16cid:durableId="2015063813">
+  <w:num w:numId="1" w16cid:durableId="1233663200">
     <w:abstractNumId w:val="0"/>
   </w:num>
-  <w:num w:numId="2" w16cid:durableId="1586645043">
+  <w:num w:numId="2" w16cid:durableId="617183411">
     <w:abstractNumId w:val="1"/>
   </w:num>
-  <w:num w:numId="3" w16cid:durableId="2139376169">
+  <w:num w:numId="3" w16cid:durableId="1680768773">
     <w:abstractNumId w:val="2"/>
     <w:lvlOverride w:ilvl="0">
       <w:startOverride w:val="1"/>
@@ -1794,7 +1797,7 @@
       <w:startOverride w:val="1"/>
     </w:lvlOverride>
   </w:num>
-  <w:num w:numId="4" w16cid:durableId="328096291">
+  <w:num w:numId="4" w16cid:durableId="1843470375">
     <w:abstractNumId w:val="1"/>
   </w:num>
 </w:numbering>
@@ -3025,7 +3028,7 @@
   <w:style w:type="table" w:styleId="TableGrid">
     <w:name w:val="Table Grid"/>
     <w:basedOn w:val="TableNormal"/>
-    <w:rsid w:val="00DF7683"/>
+    <w:rsid w:val="004464E2"/>
     <w:pPr>
       <w:spacing w:after="0"/>
     </w:pPr>
@@ -3044,7 +3047,7 @@
     <w:name w:val="header"/>
     <w:basedOn w:val="Normal"/>
     <w:link w:val="HeaderChar"/>
-    <w:rsid w:val="00DF7683"/>
+    <w:rsid w:val="004464E2"/>
     <w:pPr>
       <w:tabs>
         <w:tab w:val="center" w:pos="4680"/>
@@ -3057,7 +3060,7 @@
     <w:name w:val="Header Char"/>
     <w:basedOn w:val="DefaultParagraphFont"/>
     <w:link w:val="Header"/>
-    <w:rsid w:val="00DF7683"/>
+    <w:rsid w:val="004464E2"/>
     <w:rPr>
       <w:rFonts w:ascii="Georgia" w:hAnsi="Georgia"/>
       <w:sz w:val="20"/>
@@ -3067,7 +3070,7 @@
     <w:name w:val="footer"/>
     <w:basedOn w:val="Normal"/>
     <w:link w:val="FooterChar"/>
-    <w:rsid w:val="00DF7683"/>
+    <w:rsid w:val="004464E2"/>
     <w:pPr>
       <w:tabs>
         <w:tab w:val="center" w:pos="4680"/>
@@ -3080,7 +3083,7 @@
     <w:name w:val="Footer Char"/>
     <w:basedOn w:val="DefaultParagraphFont"/>
     <w:link w:val="Footer"/>
-    <w:rsid w:val="00DF7683"/>
+    <w:rsid w:val="004464E2"/>
     <w:rPr>
       <w:rFonts w:ascii="Georgia" w:hAnsi="Georgia"/>
       <w:sz w:val="20"/>

</xml_diff>

<commit_message>
Continuum's people as our own records have them: Beintema a Partner, Eeman an architect, Steele the third partner
Ian's catch: the brain already held the titles; the doc had used Jim's spoken word.

Co-Authored-By: Claude Fable 5.1 <noreply@anthropic.com>
Claude-Session: https://claude.ai/code/session_01J55941tRFE1tGX63LJBUVG
</commit_message>
<xml_diff>
--- a/docs/BD-Vancouver-Updates-ExecSummary-2026-09-03.docx
+++ b/docs/BD-Vancouver-Updates-ExecSummary-2026-09-03.docx
@@ -237,7 +237,7 @@
         <w:t>Continuum Architecture</w:t>
       </w:r>
       <w:r>
-        <w:t xml:space="preserve"> in Victoria (partners Jeremy Beintema and Wil Wiens), who appear to hold most of that developer’s work. Rory to follow up.</w:t>
+        <w:t xml:space="preserve"> in Victoria (partners Lance Steele, Jeremy Beintema and Wil Wiens), who appear to hold most of that developer’s work. Rory to follow up.</w:t>
       </w:r>
     </w:p>
     <w:p>
@@ -1161,7 +1161,7 @@
         <w:t>Rory:</w:t>
       </w:r>
       <w:r>
-        <w:t xml:space="preserve"> Go and see Continuum Architecture in Victoria. Ben Smith gave Jim two names there as a soft intro, Jeremy Beintema, a principal, and Gregory Eeman, the two working on the Trillium job KOR proposed on; Jim has put them in the spreadsheet. Ask Ike about the Perkins&amp;Will invite. The conversions blurb was Rory’s idea; Ian drafts it.</w:t>
+        <w:t xml:space="preserve"> Go and see Continuum Architecture in Victoria. Ben Smith gave Jim two names there as a soft intro, Jeremy Beintema, a partner, and Gregory Eeman, an architect there, the two working on the Trillium job KOR proposed on; Jim has put them in the spreadsheet. Ask Ike about the Perkins&amp;Will invite. The conversions blurb was Rory’s idea; Ian drafts it.</w:t>
       </w:r>
     </w:p>
     <w:p>
@@ -1497,7 +1497,7 @@
   <w:abstractNum w:abstractNumId="0" w15:restartNumberingAfterBreak="0">
     <w:nsid w:val="0000A990"/>
     <w:multiLevelType w:val="multilevel"/>
-    <w:tmpl w:val="19A088EC"/>
+    <w:tmpl w:val="63BEFDBE"/>
     <w:lvl w:ilvl="0">
       <w:numFmt w:val="bullet"/>
       <w:lvlText w:val=" "/>
@@ -1574,7 +1574,7 @@
   <w:abstractNum w:abstractNumId="1" w15:restartNumberingAfterBreak="0">
     <w:nsid w:val="0000A991"/>
     <w:multiLevelType w:val="multilevel"/>
-    <w:tmpl w:val="ED8CCC20"/>
+    <w:tmpl w:val="3AC4F078"/>
     <w:lvl w:ilvl="0">
       <w:numFmt w:val="bullet"/>
       <w:lvlText w:val=""/>
@@ -1678,7 +1678,7 @@
   <w:abstractNum w:abstractNumId="2" w15:restartNumberingAfterBreak="0">
     <w:nsid w:val="00A99411"/>
     <w:multiLevelType w:val="multilevel"/>
-    <w:tmpl w:val="B7781174"/>
+    <w:tmpl w:val="ADD8D1A0"/>
     <w:lvl w:ilvl="0">
       <w:start w:val="1"/>
       <w:numFmt w:val="decimal"/>
@@ -1761,13 +1761,13 @@
       </w:pPr>
     </w:lvl>
   </w:abstractNum>
-  <w:num w:numId="1" w16cid:durableId="1233663200">
+  <w:num w:numId="1" w16cid:durableId="1978952916">
     <w:abstractNumId w:val="0"/>
   </w:num>
-  <w:num w:numId="2" w16cid:durableId="617183411">
+  <w:num w:numId="2" w16cid:durableId="366221770">
     <w:abstractNumId w:val="1"/>
   </w:num>
-  <w:num w:numId="3" w16cid:durableId="1680768773">
+  <w:num w:numId="3" w16cid:durableId="901450922">
     <w:abstractNumId w:val="2"/>
     <w:lvlOverride w:ilvl="0">
       <w:startOverride w:val="1"/>
@@ -1797,7 +1797,7 @@
       <w:startOverride w:val="1"/>
     </w:lvlOverride>
   </w:num>
-  <w:num w:numId="4" w16cid:durableId="1843470375">
+  <w:num w:numId="4" w16cid:durableId="582957118">
     <w:abstractNumId w:val="1"/>
   </w:num>
 </w:numbering>
@@ -3028,7 +3028,7 @@
   <w:style w:type="table" w:styleId="TableGrid">
     <w:name w:val="Table Grid"/>
     <w:basedOn w:val="TableNormal"/>
-    <w:rsid w:val="004464E2"/>
+    <w:rsid w:val="00A46273"/>
     <w:pPr>
       <w:spacing w:after="0"/>
     </w:pPr>
@@ -3047,7 +3047,7 @@
     <w:name w:val="header"/>
     <w:basedOn w:val="Normal"/>
     <w:link w:val="HeaderChar"/>
-    <w:rsid w:val="004464E2"/>
+    <w:rsid w:val="00A46273"/>
     <w:pPr>
       <w:tabs>
         <w:tab w:val="center" w:pos="4680"/>
@@ -3060,7 +3060,7 @@
     <w:name w:val="Header Char"/>
     <w:basedOn w:val="DefaultParagraphFont"/>
     <w:link w:val="Header"/>
-    <w:rsid w:val="004464E2"/>
+    <w:rsid w:val="00A46273"/>
     <w:rPr>
       <w:rFonts w:ascii="Georgia" w:hAnsi="Georgia"/>
       <w:sz w:val="20"/>
@@ -3070,7 +3070,7 @@
     <w:name w:val="footer"/>
     <w:basedOn w:val="Normal"/>
     <w:link w:val="FooterChar"/>
-    <w:rsid w:val="004464E2"/>
+    <w:rsid w:val="00A46273"/>
     <w:pPr>
       <w:tabs>
         <w:tab w:val="center" w:pos="4680"/>
@@ -3083,7 +3083,7 @@
     <w:name w:val="Footer Char"/>
     <w:basedOn w:val="DefaultParagraphFont"/>
     <w:link w:val="Footer"/>
-    <w:rsid w:val="004464E2"/>
+    <w:rsid w:val="00A46273"/>
     <w:rPr>
       <w:rFonts w:ascii="Georgia" w:hAnsi="Georgia"/>
       <w:sz w:val="20"/>

</xml_diff>